<commit_message>
chore: save current project state
</commit_message>
<xml_diff>
--- a/backend/app/document_generation/documents/RKN_notification/template1.docx
+++ b/backend/app/document_generation/documents/RKN_notification/template1.docx
@@ -156,6 +156,7 @@
               <w:pStyle w:val="Standard"/>
               <w:spacing w:after="0" w:line="240" w:lineRule="auto"/>
             </w:pPr>
+            <w:proofErr w:type="gramStart"/>
             <w:r>
               <w:rPr>
                 <w:rFonts w:ascii="Times New Roman" w:hAnsi="Times New Roman" w:cs="Times New Roman"/>
@@ -173,6 +174,7 @@
               </w:rPr>
               <w:t>RKN</w:t>
             </w:r>
+            <w:proofErr w:type="gramEnd"/>
             <w:r>
               <w:rPr>
                 <w:rFonts w:ascii="Times New Roman" w:hAnsi="Times New Roman" w:cs="Times New Roman"/>
@@ -304,6 +306,7 @@
         </w:rPr>
         <w:t xml:space="preserve">: </w:t>
       </w:r>
+      <w:proofErr w:type="gramStart"/>
       <w:r>
         <w:rPr>
           <w:rFonts w:ascii="Times New Roman" w:hAnsi="Times New Roman" w:cs="Times New Roman"/>
@@ -321,6 +324,7 @@
         </w:rPr>
         <w:t>org</w:t>
       </w:r>
+      <w:proofErr w:type="gramEnd"/>
       <w:r>
         <w:rPr>
           <w:rFonts w:ascii="Times New Roman" w:hAnsi="Times New Roman" w:cs="Times New Roman"/>
@@ -346,6 +350,7 @@
         </w:rPr>
         <w:t>_</w:t>
       </w:r>
+      <w:proofErr w:type="gramStart"/>
       <w:r>
         <w:rPr>
           <w:rFonts w:ascii="Times New Roman" w:hAnsi="Times New Roman" w:cs="Times New Roman"/>
@@ -361,7 +366,16 @@
           <w:sz w:val="24"/>
           <w:szCs w:val="24"/>
         </w:rPr>
-        <w:t xml:space="preserve"> }}</w:t>
+        <w:t xml:space="preserve"> }</w:t>
+      </w:r>
+      <w:proofErr w:type="gramEnd"/>
+      <w:r>
+        <w:rPr>
+          <w:rFonts w:ascii="Times New Roman" w:hAnsi="Times New Roman" w:cs="Times New Roman"/>
+          <w:sz w:val="24"/>
+          <w:szCs w:val="24"/>
+        </w:rPr>
+        <w:t>}</w:t>
       </w:r>
     </w:p>
     <w:p>
@@ -385,6 +399,7 @@
         </w:rPr>
         <w:t xml:space="preserve">Дата изменения сведений, содержащихся в уведомлении о намерении осуществлять обработку персональных данных: </w:t>
       </w:r>
+      <w:proofErr w:type="gramStart"/>
       <w:r>
         <w:rPr>
           <w:rFonts w:ascii="Times New Roman" w:hAnsi="Times New Roman" w:cs="Times New Roman"/>
@@ -402,6 +417,7 @@
         </w:rPr>
         <w:t>change</w:t>
       </w:r>
+      <w:proofErr w:type="gramEnd"/>
       <w:r>
         <w:rPr>
           <w:rFonts w:ascii="Times New Roman" w:hAnsi="Times New Roman" w:cs="Times New Roman"/>
@@ -410,6 +426,7 @@
         </w:rPr>
         <w:t>_</w:t>
       </w:r>
+      <w:proofErr w:type="gramStart"/>
       <w:r>
         <w:rPr>
           <w:rFonts w:ascii="Times New Roman" w:hAnsi="Times New Roman" w:cs="Times New Roman"/>
@@ -425,7 +442,16 @@
           <w:sz w:val="24"/>
           <w:szCs w:val="24"/>
         </w:rPr>
-        <w:t xml:space="preserve"> }}</w:t>
+        <w:t xml:space="preserve"> }</w:t>
+      </w:r>
+      <w:proofErr w:type="gramEnd"/>
+      <w:r>
+        <w:rPr>
+          <w:rFonts w:ascii="Times New Roman" w:hAnsi="Times New Roman" w:cs="Times New Roman"/>
+          <w:sz w:val="24"/>
+          <w:szCs w:val="24"/>
+        </w:rPr>
+        <w:t>}</w:t>
       </w:r>
     </w:p>
     <w:p>
@@ -485,6 +511,7 @@
         </w:rPr>
         <w:t xml:space="preserve"> </w:t>
       </w:r>
+      <w:proofErr w:type="gramStart"/>
       <w:r>
         <w:rPr>
           <w:rFonts w:ascii="Times New Roman" w:hAnsi="Times New Roman" w:cs="Times New Roman"/>
@@ -502,6 +529,7 @@
         </w:rPr>
         <w:t>main</w:t>
       </w:r>
+      <w:proofErr w:type="gramEnd"/>
       <w:r>
         <w:rPr>
           <w:rFonts w:ascii="Times New Roman" w:hAnsi="Times New Roman" w:cs="Times New Roman"/>
@@ -527,6 +555,7 @@
         </w:rPr>
         <w:t>_</w:t>
       </w:r>
+      <w:proofErr w:type="gramStart"/>
       <w:r>
         <w:rPr>
           <w:rFonts w:ascii="Times New Roman" w:hAnsi="Times New Roman" w:cs="Times New Roman"/>
@@ -542,7 +571,16 @@
           <w:sz w:val="24"/>
           <w:szCs w:val="24"/>
         </w:rPr>
-        <w:t xml:space="preserve"> }}</w:t>
+        <w:t xml:space="preserve"> }</w:t>
+      </w:r>
+      <w:proofErr w:type="gramEnd"/>
+      <w:r>
+        <w:rPr>
+          <w:rFonts w:ascii="Times New Roman" w:hAnsi="Times New Roman" w:cs="Times New Roman"/>
+          <w:sz w:val="24"/>
+          <w:szCs w:val="24"/>
+        </w:rPr>
+        <w:t>}</w:t>
       </w:r>
     </w:p>
     <w:p>
@@ -555,9 +593,9 @@
           <w:bCs/>
           <w:sz w:val="24"/>
           <w:szCs w:val="24"/>
-          <w:lang w:val="en-US"/>
         </w:rPr>
       </w:pPr>
+      <w:proofErr w:type="gramStart"/>
       <w:r>
         <w:rPr>
           <w:rStyle w:val="hinttext"/>
@@ -577,35 +615,367 @@
           <w:bCs/>
           <w:sz w:val="24"/>
           <w:szCs w:val="24"/>
-          <w:lang w:val="en-US"/>
         </w:rPr>
         <w:t xml:space="preserve">{ </w:t>
       </w:r>
+      <w:r>
+        <w:rPr>
+          <w:rStyle w:val="hinttext"/>
+          <w:rFonts w:ascii="Times New Roman" w:hAnsi="Times New Roman" w:cs="Times New Roman"/>
+          <w:b/>
+          <w:bCs/>
+          <w:sz w:val="24"/>
+          <w:szCs w:val="24"/>
+          <w:lang w:val="en-US"/>
+        </w:rPr>
+        <w:t>org</w:t>
+      </w:r>
+      <w:proofErr w:type="gramEnd"/>
+      <w:r>
+        <w:rPr>
+          <w:rStyle w:val="hinttext"/>
+          <w:rFonts w:ascii="Times New Roman" w:hAnsi="Times New Roman" w:cs="Times New Roman"/>
+          <w:b/>
+          <w:bCs/>
+          <w:sz w:val="24"/>
+          <w:szCs w:val="24"/>
+        </w:rPr>
+        <w:t>_</w:t>
+      </w:r>
+      <w:proofErr w:type="gramStart"/>
+      <w:r>
+        <w:rPr>
+          <w:rStyle w:val="hinttext"/>
+          <w:rFonts w:ascii="Times New Roman" w:hAnsi="Times New Roman" w:cs="Times New Roman"/>
+          <w:b/>
+          <w:bCs/>
+          <w:sz w:val="24"/>
+          <w:szCs w:val="24"/>
+          <w:lang w:val="en-US"/>
+        </w:rPr>
+        <w:t>info</w:t>
+      </w:r>
+      <w:r>
+        <w:rPr>
+          <w:rStyle w:val="hinttext"/>
+          <w:rFonts w:ascii="Times New Roman" w:hAnsi="Times New Roman" w:cs="Times New Roman"/>
+          <w:b/>
+          <w:bCs/>
+          <w:sz w:val="24"/>
+          <w:szCs w:val="24"/>
+        </w:rPr>
+        <w:t xml:space="preserve"> }</w:t>
+      </w:r>
+      <w:proofErr w:type="gramEnd"/>
+      <w:r>
+        <w:rPr>
+          <w:rStyle w:val="hinttext"/>
+          <w:rFonts w:ascii="Times New Roman" w:hAnsi="Times New Roman" w:cs="Times New Roman"/>
+          <w:b/>
+          <w:bCs/>
+          <w:sz w:val="24"/>
+          <w:szCs w:val="24"/>
+        </w:rPr>
+        <w:t>}</w:t>
+      </w:r>
+    </w:p>
+    <w:p>
+      <w:pPr>
+        <w:pStyle w:val="Standard"/>
+        <w:rPr>
+          <w:rFonts w:ascii="Times New Roman" w:hAnsi="Times New Roman" w:cs="Times New Roman"/>
+          <w:sz w:val="24"/>
+          <w:szCs w:val="24"/>
+        </w:rPr>
+      </w:pPr>
+      <w:r>
+        <w:rPr>
+          <w:rStyle w:val="hinttext"/>
+          <w:rFonts w:ascii="Times New Roman" w:hAnsi="Times New Roman" w:cs="Times New Roman"/>
+          <w:b/>
+          <w:bCs/>
+          <w:sz w:val="24"/>
+          <w:szCs w:val="24"/>
+        </w:rPr>
+        <w:t>Адрес оператора</w:t>
+      </w:r>
+    </w:p>
+    <w:p>
+      <w:pPr>
+        <w:pStyle w:val="Standard"/>
+        <w:rPr>
+          <w:rFonts w:ascii="Times New Roman" w:hAnsi="Times New Roman" w:cs="Times New Roman"/>
+          <w:b/>
+          <w:bCs/>
+          <w:sz w:val="24"/>
+          <w:szCs w:val="24"/>
+        </w:rPr>
+      </w:pPr>
+      <w:r>
+        <w:rPr>
+          <w:rFonts w:ascii="Times New Roman" w:hAnsi="Times New Roman" w:cs="Times New Roman"/>
+          <w:b/>
+          <w:bCs/>
+          <w:sz w:val="24"/>
+          <w:szCs w:val="24"/>
+        </w:rPr>
+        <w:tab/>
+      </w:r>
+      <w:r>
+        <w:rPr>
+          <w:rFonts w:ascii="Times New Roman" w:hAnsi="Times New Roman" w:cs="Times New Roman"/>
+          <w:b/>
+          <w:bCs/>
+          <w:sz w:val="24"/>
+          <w:szCs w:val="24"/>
+        </w:rPr>
+        <w:t>Адрес</w:t>
+      </w:r>
+      <w:r>
+        <w:rPr>
+          <w:rFonts w:ascii="Times New Roman" w:hAnsi="Times New Roman" w:cs="Times New Roman"/>
+          <w:b/>
+          <w:bCs/>
+          <w:sz w:val="24"/>
+          <w:szCs w:val="24"/>
+        </w:rPr>
+        <w:t xml:space="preserve"> </w:t>
+      </w:r>
+      <w:r>
+        <w:rPr>
+          <w:rFonts w:ascii="Times New Roman" w:hAnsi="Times New Roman" w:cs="Times New Roman"/>
+          <w:b/>
+          <w:bCs/>
+          <w:sz w:val="24"/>
+          <w:szCs w:val="24"/>
+        </w:rPr>
+        <w:t>местонахождения</w:t>
+      </w:r>
+      <w:r>
+        <w:rPr>
+          <w:rFonts w:ascii="Times New Roman" w:hAnsi="Times New Roman" w:cs="Times New Roman"/>
+          <w:b/>
+          <w:bCs/>
+          <w:sz w:val="24"/>
+          <w:szCs w:val="24"/>
+        </w:rPr>
+        <w:t xml:space="preserve">: </w:t>
+      </w:r>
+      <w:proofErr w:type="gramStart"/>
+      <w:r>
+        <w:rPr>
+          <w:rFonts w:ascii="Times New Roman" w:hAnsi="Times New Roman" w:cs="Times New Roman"/>
+          <w:b/>
+          <w:bCs/>
+          <w:sz w:val="24"/>
+          <w:szCs w:val="24"/>
+        </w:rPr>
+        <w:t xml:space="preserve">{{ </w:t>
+      </w:r>
+      <w:r>
+        <w:rPr>
+          <w:rFonts w:ascii="Times New Roman" w:hAnsi="Times New Roman" w:cs="Times New Roman"/>
+          <w:b/>
+          <w:bCs/>
+          <w:sz w:val="24"/>
+          <w:szCs w:val="24"/>
+          <w:lang w:val="en-US"/>
+        </w:rPr>
+        <w:t>org</w:t>
+      </w:r>
+      <w:proofErr w:type="gramEnd"/>
+      <w:r>
+        <w:rPr>
+          <w:rFonts w:ascii="Times New Roman" w:hAnsi="Times New Roman" w:cs="Times New Roman"/>
+          <w:b/>
+          <w:bCs/>
+          <w:sz w:val="24"/>
+          <w:szCs w:val="24"/>
+        </w:rPr>
+        <w:t>_</w:t>
+      </w:r>
       <w:proofErr w:type="spellStart"/>
-      <w:r>
-        <w:rPr>
-          <w:rStyle w:val="hinttext"/>
-          <w:rFonts w:ascii="Times New Roman" w:hAnsi="Times New Roman" w:cs="Times New Roman"/>
-          <w:b/>
-          <w:bCs/>
-          <w:sz w:val="24"/>
-          <w:szCs w:val="24"/>
-          <w:lang w:val="en-US"/>
-        </w:rPr>
-        <w:t>org_info</w:t>
+      <w:proofErr w:type="gramStart"/>
+      <w:r>
+        <w:rPr>
+          <w:rFonts w:ascii="Times New Roman" w:hAnsi="Times New Roman" w:cs="Times New Roman"/>
+          <w:b/>
+          <w:bCs/>
+          <w:sz w:val="24"/>
+          <w:szCs w:val="24"/>
+          <w:lang w:val="en-US"/>
+        </w:rPr>
+        <w:t>adress</w:t>
       </w:r>
       <w:proofErr w:type="spellEnd"/>
       <w:r>
         <w:rPr>
-          <w:rStyle w:val="hinttext"/>
-          <w:rFonts w:ascii="Times New Roman" w:hAnsi="Times New Roman" w:cs="Times New Roman"/>
-          <w:b/>
-          <w:bCs/>
-          <w:sz w:val="24"/>
-          <w:szCs w:val="24"/>
-          <w:lang w:val="en-US"/>
-        </w:rPr>
-        <w:t xml:space="preserve"> }}</w:t>
+          <w:rFonts w:ascii="Times New Roman" w:hAnsi="Times New Roman" w:cs="Times New Roman"/>
+          <w:b/>
+          <w:bCs/>
+          <w:sz w:val="24"/>
+          <w:szCs w:val="24"/>
+        </w:rPr>
+        <w:t xml:space="preserve"> }</w:t>
+      </w:r>
+      <w:proofErr w:type="gramEnd"/>
+      <w:r>
+        <w:rPr>
+          <w:rFonts w:ascii="Times New Roman" w:hAnsi="Times New Roman" w:cs="Times New Roman"/>
+          <w:b/>
+          <w:bCs/>
+          <w:sz w:val="24"/>
+          <w:szCs w:val="24"/>
+        </w:rPr>
+        <w:t>}</w:t>
+      </w:r>
+    </w:p>
+    <w:p>
+      <w:pPr>
+        <w:pStyle w:val="Standard"/>
+        <w:rPr>
+          <w:b/>
+          <w:bCs/>
+        </w:rPr>
+      </w:pPr>
+      <w:r>
+        <w:rPr>
+          <w:rFonts w:ascii="Times New Roman" w:hAnsi="Times New Roman" w:cs="Times New Roman"/>
+          <w:b/>
+          <w:bCs/>
+          <w:sz w:val="24"/>
+          <w:szCs w:val="24"/>
+        </w:rPr>
+        <w:tab/>
+      </w:r>
+      <w:r>
+        <w:rPr>
+          <w:rFonts w:ascii="Times New Roman" w:hAnsi="Times New Roman" w:cs="Times New Roman"/>
+          <w:b/>
+          <w:bCs/>
+          <w:sz w:val="24"/>
+          <w:szCs w:val="24"/>
+        </w:rPr>
+        <w:t>Почтовый</w:t>
+      </w:r>
+      <w:r>
+        <w:rPr>
+          <w:rFonts w:ascii="Times New Roman" w:hAnsi="Times New Roman" w:cs="Times New Roman"/>
+          <w:b/>
+          <w:bCs/>
+          <w:sz w:val="24"/>
+          <w:szCs w:val="24"/>
+        </w:rPr>
+        <w:t xml:space="preserve"> </w:t>
+      </w:r>
+      <w:r>
+        <w:rPr>
+          <w:rFonts w:ascii="Times New Roman" w:hAnsi="Times New Roman" w:cs="Times New Roman"/>
+          <w:b/>
+          <w:bCs/>
+          <w:sz w:val="24"/>
+          <w:szCs w:val="24"/>
+        </w:rPr>
+        <w:t>адрес</w:t>
+      </w:r>
+      <w:r>
+        <w:rPr>
+          <w:rFonts w:ascii="Times New Roman" w:hAnsi="Times New Roman" w:cs="Times New Roman"/>
+          <w:b/>
+          <w:bCs/>
+          <w:sz w:val="24"/>
+          <w:szCs w:val="24"/>
+        </w:rPr>
+        <w:t xml:space="preserve">: </w:t>
+      </w:r>
+      <w:proofErr w:type="gramStart"/>
+      <w:r>
+        <w:rPr>
+          <w:rFonts w:ascii="Times New Roman" w:hAnsi="Times New Roman" w:cs="Times New Roman"/>
+          <w:b/>
+          <w:bCs/>
+          <w:sz w:val="24"/>
+          <w:szCs w:val="24"/>
+        </w:rPr>
+        <w:t xml:space="preserve">{{ </w:t>
+      </w:r>
+      <w:r>
+        <w:rPr>
+          <w:rFonts w:ascii="Times New Roman" w:hAnsi="Times New Roman" w:cs="Times New Roman"/>
+          <w:b/>
+          <w:bCs/>
+          <w:sz w:val="24"/>
+          <w:szCs w:val="24"/>
+          <w:lang w:val="en-US"/>
+        </w:rPr>
+        <w:t>mail</w:t>
+      </w:r>
+      <w:proofErr w:type="gramEnd"/>
+      <w:r>
+        <w:rPr>
+          <w:rFonts w:ascii="Times New Roman" w:hAnsi="Times New Roman" w:cs="Times New Roman"/>
+          <w:b/>
+          <w:bCs/>
+          <w:sz w:val="24"/>
+          <w:szCs w:val="24"/>
+        </w:rPr>
+        <w:t>_</w:t>
+      </w:r>
+      <w:r>
+        <w:rPr>
+          <w:rFonts w:ascii="Times New Roman" w:hAnsi="Times New Roman" w:cs="Times New Roman"/>
+          <w:b/>
+          <w:bCs/>
+          <w:sz w:val="24"/>
+          <w:szCs w:val="24"/>
+          <w:lang w:val="en-US"/>
+        </w:rPr>
+        <w:t>org</w:t>
+      </w:r>
+      <w:r>
+        <w:rPr>
+          <w:rFonts w:ascii="Times New Roman" w:hAnsi="Times New Roman" w:cs="Times New Roman"/>
+          <w:b/>
+          <w:bCs/>
+          <w:sz w:val="24"/>
+          <w:szCs w:val="24"/>
+        </w:rPr>
+        <w:t>_</w:t>
+      </w:r>
+      <w:proofErr w:type="spellStart"/>
+      <w:proofErr w:type="gramStart"/>
+      <w:r>
+        <w:rPr>
+          <w:rFonts w:ascii="Times New Roman" w:hAnsi="Times New Roman" w:cs="Times New Roman"/>
+          <w:b/>
+          <w:bCs/>
+          <w:sz w:val="24"/>
+          <w:szCs w:val="24"/>
+          <w:lang w:val="en-US"/>
+        </w:rPr>
+        <w:t>adress</w:t>
+      </w:r>
+      <w:proofErr w:type="spellEnd"/>
+      <w:r>
+        <w:rPr>
+          <w:rFonts w:ascii="Times New Roman" w:hAnsi="Times New Roman" w:cs="Times New Roman"/>
+          <w:b/>
+          <w:bCs/>
+          <w:sz w:val="24"/>
+          <w:szCs w:val="24"/>
+        </w:rPr>
+        <w:t xml:space="preserve"> }</w:t>
+      </w:r>
+      <w:proofErr w:type="gramEnd"/>
+      <w:r>
+        <w:rPr>
+          <w:rFonts w:ascii="Times New Roman" w:hAnsi="Times New Roman" w:cs="Times New Roman"/>
+          <w:b/>
+          <w:bCs/>
+          <w:sz w:val="24"/>
+          <w:szCs w:val="24"/>
+        </w:rPr>
+        <w:t>}</w:t>
       </w:r>
     </w:p>
     <w:p>
@@ -614,14 +984,23 @@
       </w:pPr>
       <w:r>
         <w:rPr>
-          <w:rStyle w:val="hinttext"/>
-          <w:rFonts w:ascii="Times New Roman" w:hAnsi="Times New Roman" w:cs="Times New Roman"/>
-          <w:b/>
-          <w:bCs/>
-          <w:sz w:val="24"/>
-          <w:szCs w:val="24"/>
-        </w:rPr>
-        <w:t>Сокращенное наименование оператора:</w:t>
+          <w:rFonts w:ascii="Times New Roman" w:hAnsi="Times New Roman" w:cs="Times New Roman"/>
+          <w:b/>
+          <w:bCs/>
+          <w:sz w:val="24"/>
+          <w:szCs w:val="24"/>
+        </w:rPr>
+        <w:t>Телефон</w:t>
+      </w:r>
+      <w:r>
+        <w:rPr>
+          <w:rFonts w:ascii="Times New Roman" w:hAnsi="Times New Roman" w:cs="Times New Roman"/>
+          <w:b/>
+          <w:bCs/>
+          <w:sz w:val="24"/>
+          <w:szCs w:val="24"/>
+        </w:rPr>
+        <w:t>:</w:t>
       </w:r>
       <w:r>
         <w:rPr>
@@ -631,324 +1010,59 @@
         </w:rPr>
         <w:t xml:space="preserve"> </w:t>
       </w:r>
-      <w:r>
-        <w:rPr>
-          <w:rStyle w:val="hinttext"/>
+      <w:proofErr w:type="gramStart"/>
+      <w:r>
+        <w:rPr>
           <w:rFonts w:ascii="Times New Roman" w:hAnsi="Times New Roman" w:cs="Times New Roman"/>
           <w:sz w:val="24"/>
           <w:szCs w:val="24"/>
         </w:rPr>
         <w:t xml:space="preserve">{{ </w:t>
       </w:r>
-      <w:proofErr w:type="spellStart"/>
-      <w:r>
-        <w:rPr>
-          <w:rStyle w:val="hinttext"/>
-          <w:rFonts w:ascii="Times New Roman" w:hAnsi="Times New Roman" w:cs="Times New Roman"/>
-          <w:sz w:val="24"/>
-          <w:szCs w:val="24"/>
-          <w:lang w:val="en-US"/>
-        </w:rPr>
-        <w:t>sokr</w:t>
-      </w:r>
-      <w:proofErr w:type="spellEnd"/>
-      <w:r>
-        <w:rPr>
-          <w:rStyle w:val="hinttext"/>
+      <w:r>
+        <w:rPr>
+          <w:rFonts w:ascii="Times New Roman" w:hAnsi="Times New Roman" w:cs="Times New Roman"/>
+          <w:sz w:val="24"/>
+          <w:szCs w:val="24"/>
+          <w:lang w:val="en-US"/>
+        </w:rPr>
+        <w:t>org</w:t>
+      </w:r>
+      <w:proofErr w:type="gramEnd"/>
+      <w:r>
+        <w:rPr>
           <w:rFonts w:ascii="Times New Roman" w:hAnsi="Times New Roman" w:cs="Times New Roman"/>
           <w:sz w:val="24"/>
           <w:szCs w:val="24"/>
         </w:rPr>
         <w:t>_</w:t>
       </w:r>
-      <w:r>
-        <w:rPr>
-          <w:rStyle w:val="hinttext"/>
-          <w:rFonts w:ascii="Times New Roman" w:hAnsi="Times New Roman" w:cs="Times New Roman"/>
-          <w:sz w:val="24"/>
-          <w:szCs w:val="24"/>
-          <w:lang w:val="en-US"/>
-        </w:rPr>
-        <w:t>org</w:t>
-      </w:r>
-      <w:r>
-        <w:rPr>
-          <w:rStyle w:val="hinttext"/>
-          <w:rFonts w:ascii="Times New Roman" w:hAnsi="Times New Roman" w:cs="Times New Roman"/>
-          <w:sz w:val="24"/>
-          <w:szCs w:val="24"/>
-        </w:rPr>
-        <w:t>_</w:t>
-      </w:r>
-      <w:r>
-        <w:rPr>
-          <w:rStyle w:val="hinttext"/>
-          <w:rFonts w:ascii="Times New Roman" w:hAnsi="Times New Roman" w:cs="Times New Roman"/>
-          <w:sz w:val="24"/>
-          <w:szCs w:val="24"/>
-          <w:lang w:val="en-US"/>
-        </w:rPr>
-        <w:t>name</w:t>
-      </w:r>
-      <w:r>
-        <w:rPr>
-          <w:rStyle w:val="hinttext"/>
-          <w:rFonts w:ascii="Times New Roman" w:hAnsi="Times New Roman" w:cs="Times New Roman"/>
-          <w:sz w:val="24"/>
-          <w:szCs w:val="24"/>
-        </w:rPr>
-        <w:t xml:space="preserve"> }}</w:t>
-      </w:r>
-    </w:p>
-    <w:p>
-      <w:pPr>
-        <w:pStyle w:val="Standard"/>
-        <w:rPr>
-          <w:rFonts w:ascii="Times New Roman" w:hAnsi="Times New Roman" w:cs="Times New Roman"/>
-          <w:sz w:val="24"/>
-          <w:szCs w:val="24"/>
-        </w:rPr>
-      </w:pPr>
-      <w:r>
-        <w:rPr>
-          <w:rStyle w:val="hinttext"/>
-          <w:rFonts w:ascii="Times New Roman" w:hAnsi="Times New Roman" w:cs="Times New Roman"/>
-          <w:b/>
-          <w:bCs/>
-          <w:sz w:val="24"/>
-          <w:szCs w:val="24"/>
-        </w:rPr>
-        <w:t>Адрес оператора</w:t>
-      </w:r>
-    </w:p>
-    <w:p>
-      <w:pPr>
-        <w:pStyle w:val="Standard"/>
-        <w:rPr>
-          <w:rFonts w:ascii="Times New Roman" w:hAnsi="Times New Roman" w:cs="Times New Roman"/>
-          <w:b/>
-          <w:bCs/>
-          <w:sz w:val="24"/>
-          <w:szCs w:val="24"/>
-        </w:rPr>
-      </w:pPr>
-      <w:r>
-        <w:rPr>
-          <w:rFonts w:ascii="Times New Roman" w:hAnsi="Times New Roman" w:cs="Times New Roman"/>
-          <w:b/>
-          <w:bCs/>
-          <w:sz w:val="24"/>
-          <w:szCs w:val="24"/>
-        </w:rPr>
-        <w:tab/>
-      </w:r>
-      <w:r>
-        <w:rPr>
-          <w:rFonts w:ascii="Times New Roman" w:hAnsi="Times New Roman" w:cs="Times New Roman"/>
-          <w:b/>
-          <w:bCs/>
-          <w:sz w:val="24"/>
-          <w:szCs w:val="24"/>
-        </w:rPr>
-        <w:t>Адрес</w:t>
-      </w:r>
-      <w:r>
-        <w:rPr>
-          <w:rFonts w:ascii="Times New Roman" w:hAnsi="Times New Roman" w:cs="Times New Roman"/>
-          <w:b/>
-          <w:bCs/>
-          <w:sz w:val="24"/>
-          <w:szCs w:val="24"/>
-        </w:rPr>
-        <w:t xml:space="preserve"> </w:t>
-      </w:r>
-      <w:r>
-        <w:rPr>
-          <w:rFonts w:ascii="Times New Roman" w:hAnsi="Times New Roman" w:cs="Times New Roman"/>
-          <w:b/>
-          <w:bCs/>
-          <w:sz w:val="24"/>
-          <w:szCs w:val="24"/>
-        </w:rPr>
-        <w:t>местонахождения</w:t>
-      </w:r>
-      <w:r>
-        <w:rPr>
-          <w:rFonts w:ascii="Times New Roman" w:hAnsi="Times New Roman" w:cs="Times New Roman"/>
-          <w:b/>
-          <w:bCs/>
-          <w:sz w:val="24"/>
-          <w:szCs w:val="24"/>
-        </w:rPr>
-        <w:t xml:space="preserve">: {{ </w:t>
-      </w:r>
-      <w:r>
-        <w:rPr>
-          <w:rFonts w:ascii="Times New Roman" w:hAnsi="Times New Roman" w:cs="Times New Roman"/>
-          <w:b/>
-          <w:bCs/>
-          <w:sz w:val="24"/>
-          <w:szCs w:val="24"/>
-          <w:lang w:val="en-US"/>
-        </w:rPr>
-        <w:t>org</w:t>
-      </w:r>
-      <w:r>
-        <w:rPr>
-          <w:rFonts w:ascii="Times New Roman" w:hAnsi="Times New Roman" w:cs="Times New Roman"/>
-          <w:b/>
-          <w:bCs/>
-          <w:sz w:val="24"/>
-          <w:szCs w:val="24"/>
-        </w:rPr>
-        <w:t>_</w:t>
-      </w:r>
-      <w:proofErr w:type="spellStart"/>
-      <w:r>
-        <w:rPr>
-          <w:rFonts w:ascii="Times New Roman" w:hAnsi="Times New Roman" w:cs="Times New Roman"/>
-          <w:b/>
-          <w:bCs/>
-          <w:sz w:val="24"/>
-          <w:szCs w:val="24"/>
-          <w:lang w:val="en-US"/>
-        </w:rPr>
-        <w:t>adress</w:t>
-      </w:r>
-      <w:proofErr w:type="spellEnd"/>
-      <w:r>
-        <w:rPr>
-          <w:rFonts w:ascii="Times New Roman" w:hAnsi="Times New Roman" w:cs="Times New Roman"/>
-          <w:b/>
-          <w:bCs/>
-          <w:sz w:val="24"/>
-          <w:szCs w:val="24"/>
-        </w:rPr>
-        <w:t xml:space="preserve"> }}</w:t>
-      </w:r>
-    </w:p>
-    <w:p>
-      <w:pPr>
-        <w:pStyle w:val="Standard"/>
-        <w:rPr>
-          <w:b/>
-          <w:bCs/>
-        </w:rPr>
-      </w:pPr>
-      <w:r>
-        <w:rPr>
-          <w:rFonts w:ascii="Times New Roman" w:hAnsi="Times New Roman" w:cs="Times New Roman"/>
-          <w:b/>
-          <w:bCs/>
-          <w:sz w:val="24"/>
-          <w:szCs w:val="24"/>
-        </w:rPr>
-        <w:tab/>
-      </w:r>
-      <w:r>
-        <w:rPr>
-          <w:rFonts w:ascii="Times New Roman" w:hAnsi="Times New Roman" w:cs="Times New Roman"/>
-          <w:b/>
-          <w:bCs/>
-          <w:sz w:val="24"/>
-          <w:szCs w:val="24"/>
-        </w:rPr>
-        <w:t>Почтовый</w:t>
-      </w:r>
-      <w:r>
-        <w:rPr>
-          <w:rFonts w:ascii="Times New Roman" w:hAnsi="Times New Roman" w:cs="Times New Roman"/>
-          <w:b/>
-          <w:bCs/>
-          <w:sz w:val="24"/>
-          <w:szCs w:val="24"/>
-        </w:rPr>
-        <w:t xml:space="preserve"> </w:t>
-      </w:r>
-      <w:r>
-        <w:rPr>
-          <w:rFonts w:ascii="Times New Roman" w:hAnsi="Times New Roman" w:cs="Times New Roman"/>
-          <w:b/>
-          <w:bCs/>
-          <w:sz w:val="24"/>
-          <w:szCs w:val="24"/>
-        </w:rPr>
-        <w:t>адрес</w:t>
-      </w:r>
-      <w:r>
-        <w:rPr>
-          <w:rFonts w:ascii="Times New Roman" w:hAnsi="Times New Roman" w:cs="Times New Roman"/>
-          <w:b/>
-          <w:bCs/>
-          <w:sz w:val="24"/>
-          <w:szCs w:val="24"/>
-        </w:rPr>
-        <w:t xml:space="preserve">: {{ </w:t>
-      </w:r>
-      <w:r>
-        <w:rPr>
-          <w:rFonts w:ascii="Times New Roman" w:hAnsi="Times New Roman" w:cs="Times New Roman"/>
-          <w:b/>
-          <w:bCs/>
-          <w:sz w:val="24"/>
-          <w:szCs w:val="24"/>
-          <w:lang w:val="en-US"/>
-        </w:rPr>
-        <w:t>mail</w:t>
-      </w:r>
-      <w:r>
-        <w:rPr>
-          <w:rFonts w:ascii="Times New Roman" w:hAnsi="Times New Roman" w:cs="Times New Roman"/>
-          <w:b/>
-          <w:bCs/>
-          <w:sz w:val="24"/>
-          <w:szCs w:val="24"/>
-        </w:rPr>
-        <w:t>_</w:t>
-      </w:r>
-      <w:r>
-        <w:rPr>
-          <w:rFonts w:ascii="Times New Roman" w:hAnsi="Times New Roman" w:cs="Times New Roman"/>
-          <w:b/>
-          <w:bCs/>
-          <w:sz w:val="24"/>
-          <w:szCs w:val="24"/>
-          <w:lang w:val="en-US"/>
-        </w:rPr>
-        <w:t>org</w:t>
-      </w:r>
-      <w:r>
-        <w:rPr>
-          <w:rFonts w:ascii="Times New Roman" w:hAnsi="Times New Roman" w:cs="Times New Roman"/>
-          <w:b/>
-          <w:bCs/>
-          <w:sz w:val="24"/>
-          <w:szCs w:val="24"/>
-        </w:rPr>
-        <w:t>_</w:t>
-      </w:r>
-      <w:proofErr w:type="spellStart"/>
-      <w:r>
-        <w:rPr>
-          <w:rFonts w:ascii="Times New Roman" w:hAnsi="Times New Roman" w:cs="Times New Roman"/>
-          <w:b/>
-          <w:bCs/>
-          <w:sz w:val="24"/>
-          <w:szCs w:val="24"/>
-          <w:lang w:val="en-US"/>
-        </w:rPr>
-        <w:t>adress</w:t>
-      </w:r>
-      <w:proofErr w:type="spellEnd"/>
-      <w:r>
-        <w:rPr>
-          <w:rFonts w:ascii="Times New Roman" w:hAnsi="Times New Roman" w:cs="Times New Roman"/>
-          <w:b/>
-          <w:bCs/>
-          <w:sz w:val="24"/>
-          <w:szCs w:val="24"/>
-        </w:rPr>
-        <w:t xml:space="preserve"> }}</w:t>
+      <w:proofErr w:type="gramStart"/>
+      <w:r>
+        <w:rPr>
+          <w:rFonts w:ascii="Times New Roman" w:hAnsi="Times New Roman" w:cs="Times New Roman"/>
+          <w:sz w:val="24"/>
+          <w:szCs w:val="24"/>
+          <w:lang w:val="en-US"/>
+        </w:rPr>
+        <w:t>phone</w:t>
+      </w:r>
+      <w:r>
+        <w:rPr>
+          <w:rFonts w:ascii="Times New Roman" w:hAnsi="Times New Roman" w:cs="Times New Roman"/>
+          <w:sz w:val="24"/>
+          <w:szCs w:val="24"/>
+        </w:rPr>
+        <w:t xml:space="preserve"> }</w:t>
+      </w:r>
+      <w:proofErr w:type="gramEnd"/>
+      <w:r>
+        <w:rPr>
+          <w:rFonts w:ascii="Times New Roman" w:hAnsi="Times New Roman" w:cs="Times New Roman"/>
+          <w:sz w:val="24"/>
+          <w:szCs w:val="24"/>
+        </w:rPr>
+        <w:t>}</w:t>
       </w:r>
     </w:p>
     <w:p>
@@ -963,26 +1077,19 @@
           <w:sz w:val="24"/>
           <w:szCs w:val="24"/>
         </w:rPr>
-        <w:t>Телефон</w:t>
-      </w:r>
-      <w:r>
-        <w:rPr>
-          <w:rFonts w:ascii="Times New Roman" w:hAnsi="Times New Roman" w:cs="Times New Roman"/>
-          <w:b/>
-          <w:bCs/>
-          <w:sz w:val="24"/>
-          <w:szCs w:val="24"/>
-        </w:rPr>
-        <w:t>:</w:t>
-      </w:r>
-      <w:r>
-        <w:rPr>
-          <w:rFonts w:ascii="Times New Roman" w:hAnsi="Times New Roman" w:cs="Times New Roman"/>
-          <w:sz w:val="24"/>
-          <w:szCs w:val="24"/>
-        </w:rPr>
-        <w:t xml:space="preserve"> </w:t>
-      </w:r>
+        <w:t>Факс</w:t>
+      </w:r>
+      <w:r>
+        <w:rPr>
+          <w:rFonts w:ascii="Times New Roman" w:hAnsi="Times New Roman" w:cs="Times New Roman"/>
+          <w:b/>
+          <w:bCs/>
+          <w:sz w:val="24"/>
+          <w:szCs w:val="24"/>
+        </w:rPr>
+        <w:t xml:space="preserve">: </w:t>
+      </w:r>
+      <w:proofErr w:type="gramStart"/>
       <w:r>
         <w:rPr>
           <w:rFonts w:ascii="Times New Roman" w:hAnsi="Times New Roman" w:cs="Times New Roman"/>
@@ -1000,6 +1107,7 @@
         </w:rPr>
         <w:t>org</w:t>
       </w:r>
+      <w:proofErr w:type="gramEnd"/>
       <w:r>
         <w:rPr>
           <w:rFonts w:ascii="Times New Roman" w:hAnsi="Times New Roman" w:cs="Times New Roman"/>
@@ -1008,22 +1116,34 @@
         </w:rPr>
         <w:t>_</w:t>
       </w:r>
-      <w:r>
-        <w:rPr>
-          <w:rFonts w:ascii="Times New Roman" w:hAnsi="Times New Roman" w:cs="Times New Roman"/>
-          <w:sz w:val="24"/>
-          <w:szCs w:val="24"/>
-          <w:lang w:val="en-US"/>
-        </w:rPr>
-        <w:t>phone</w:t>
-      </w:r>
-      <w:r>
-        <w:rPr>
-          <w:rFonts w:ascii="Times New Roman" w:hAnsi="Times New Roman" w:cs="Times New Roman"/>
-          <w:sz w:val="24"/>
-          <w:szCs w:val="24"/>
-        </w:rPr>
-        <w:t xml:space="preserve"> }}</w:t>
+      <w:proofErr w:type="spellStart"/>
+      <w:proofErr w:type="gramStart"/>
+      <w:r>
+        <w:rPr>
+          <w:rFonts w:ascii="Times New Roman" w:hAnsi="Times New Roman" w:cs="Times New Roman"/>
+          <w:sz w:val="24"/>
+          <w:szCs w:val="24"/>
+          <w:lang w:val="en-US"/>
+        </w:rPr>
+        <w:t>faks</w:t>
+      </w:r>
+      <w:proofErr w:type="spellEnd"/>
+      <w:r>
+        <w:rPr>
+          <w:rFonts w:ascii="Times New Roman" w:hAnsi="Times New Roman" w:cs="Times New Roman"/>
+          <w:sz w:val="24"/>
+          <w:szCs w:val="24"/>
+        </w:rPr>
+        <w:t xml:space="preserve"> }</w:t>
+      </w:r>
+      <w:proofErr w:type="gramEnd"/>
+      <w:r>
+        <w:rPr>
+          <w:rFonts w:ascii="Times New Roman" w:hAnsi="Times New Roman" w:cs="Times New Roman"/>
+          <w:sz w:val="24"/>
+          <w:szCs w:val="24"/>
+        </w:rPr>
+        <w:t>}</w:t>
       </w:r>
     </w:p>
     <w:p>
@@ -1038,18 +1158,17 @@
           <w:sz w:val="24"/>
           <w:szCs w:val="24"/>
         </w:rPr>
-        <w:t>Факс</w:t>
-      </w:r>
-      <w:r>
-        <w:rPr>
-          <w:rFonts w:ascii="Times New Roman" w:hAnsi="Times New Roman" w:cs="Times New Roman"/>
-          <w:b/>
-          <w:bCs/>
-          <w:sz w:val="24"/>
-          <w:szCs w:val="24"/>
-        </w:rPr>
-        <w:t xml:space="preserve">: </w:t>
-      </w:r>
+        <w:t>Адрес электронной почты:</w:t>
+      </w:r>
+      <w:r>
+        <w:rPr>
+          <w:rFonts w:ascii="Times New Roman" w:hAnsi="Times New Roman" w:cs="Times New Roman"/>
+          <w:sz w:val="24"/>
+          <w:szCs w:val="24"/>
+        </w:rPr>
+        <w:t xml:space="preserve"> </w:t>
+      </w:r>
+      <w:proofErr w:type="gramStart"/>
       <w:r>
         <w:rPr>
           <w:rFonts w:ascii="Times New Roman" w:hAnsi="Times New Roman" w:cs="Times New Roman"/>
@@ -1067,6 +1186,7 @@
         </w:rPr>
         <w:t>org</w:t>
       </w:r>
+      <w:proofErr w:type="gramEnd"/>
       <w:r>
         <w:rPr>
           <w:rFonts w:ascii="Times New Roman" w:hAnsi="Times New Roman" w:cs="Times New Roman"/>
@@ -1075,24 +1195,32 @@
         </w:rPr>
         <w:t>_</w:t>
       </w:r>
-      <w:proofErr w:type="spellStart"/>
-      <w:r>
-        <w:rPr>
-          <w:rFonts w:ascii="Times New Roman" w:hAnsi="Times New Roman" w:cs="Times New Roman"/>
-          <w:sz w:val="24"/>
-          <w:szCs w:val="24"/>
-          <w:lang w:val="en-US"/>
-        </w:rPr>
-        <w:t>faks</w:t>
-      </w:r>
-      <w:proofErr w:type="spellEnd"/>
-      <w:r>
-        <w:rPr>
-          <w:rFonts w:ascii="Times New Roman" w:hAnsi="Times New Roman" w:cs="Times New Roman"/>
-          <w:sz w:val="24"/>
-          <w:szCs w:val="24"/>
-        </w:rPr>
-        <w:t xml:space="preserve"> }}</w:t>
+      <w:proofErr w:type="gramStart"/>
+      <w:r>
+        <w:rPr>
+          <w:rFonts w:ascii="Times New Roman" w:hAnsi="Times New Roman" w:cs="Times New Roman"/>
+          <w:sz w:val="24"/>
+          <w:szCs w:val="24"/>
+          <w:lang w:val="en-US"/>
+        </w:rPr>
+        <w:t>email</w:t>
+      </w:r>
+      <w:r>
+        <w:rPr>
+          <w:rFonts w:ascii="Times New Roman" w:hAnsi="Times New Roman" w:cs="Times New Roman"/>
+          <w:sz w:val="24"/>
+          <w:szCs w:val="24"/>
+        </w:rPr>
+        <w:t xml:space="preserve"> }</w:t>
+      </w:r>
+      <w:proofErr w:type="gramEnd"/>
+      <w:r>
+        <w:rPr>
+          <w:rFonts w:ascii="Times New Roman" w:hAnsi="Times New Roman" w:cs="Times New Roman"/>
+          <w:sz w:val="24"/>
+          <w:szCs w:val="24"/>
+        </w:rPr>
+        <w:t>}</w:t>
       </w:r>
     </w:p>
     <w:p>
@@ -1101,13 +1229,24 @@
       </w:pPr>
       <w:r>
         <w:rPr>
-          <w:rFonts w:ascii="Times New Roman" w:hAnsi="Times New Roman" w:cs="Times New Roman"/>
-          <w:b/>
-          <w:bCs/>
-          <w:sz w:val="24"/>
-          <w:szCs w:val="24"/>
-        </w:rPr>
-        <w:t>Адрес электронной почты:</w:t>
+          <w:rStyle w:val="hinttext"/>
+          <w:rFonts w:ascii="Times New Roman" w:hAnsi="Times New Roman" w:cs="Times New Roman"/>
+          <w:b/>
+          <w:bCs/>
+          <w:sz w:val="24"/>
+          <w:szCs w:val="24"/>
+        </w:rPr>
+        <w:t>Регионы обработки</w:t>
+      </w:r>
+      <w:r>
+        <w:rPr>
+          <w:rFonts w:ascii="Times New Roman" w:hAnsi="Times New Roman" w:cs="Times New Roman"/>
+          <w:b/>
+          <w:bCs/>
+          <w:sz w:val="24"/>
+          <w:szCs w:val="24"/>
+        </w:rPr>
+        <w:t>:</w:t>
       </w:r>
       <w:r>
         <w:rPr>
@@ -1117,6 +1256,7 @@
         </w:rPr>
         <w:t xml:space="preserve"> </w:t>
       </w:r>
+      <w:proofErr w:type="gramStart"/>
       <w:r>
         <w:rPr>
           <w:rFonts w:ascii="Times New Roman" w:hAnsi="Times New Roman" w:cs="Times New Roman"/>
@@ -1134,6 +1274,7 @@
         </w:rPr>
         <w:t>org</w:t>
       </w:r>
+      <w:proofErr w:type="gramEnd"/>
       <w:r>
         <w:rPr>
           <w:rFonts w:ascii="Times New Roman" w:hAnsi="Times New Roman" w:cs="Times New Roman"/>
@@ -1142,22 +1283,32 @@
         </w:rPr>
         <w:t>_</w:t>
       </w:r>
-      <w:r>
-        <w:rPr>
-          <w:rFonts w:ascii="Times New Roman" w:hAnsi="Times New Roman" w:cs="Times New Roman"/>
-          <w:sz w:val="24"/>
-          <w:szCs w:val="24"/>
-          <w:lang w:val="en-US"/>
-        </w:rPr>
-        <w:t>email</w:t>
-      </w:r>
-      <w:r>
-        <w:rPr>
-          <w:rFonts w:ascii="Times New Roman" w:hAnsi="Times New Roman" w:cs="Times New Roman"/>
-          <w:sz w:val="24"/>
-          <w:szCs w:val="24"/>
-        </w:rPr>
-        <w:t xml:space="preserve"> }}</w:t>
+      <w:proofErr w:type="gramStart"/>
+      <w:r>
+        <w:rPr>
+          <w:rFonts w:ascii="Times New Roman" w:hAnsi="Times New Roman" w:cs="Times New Roman"/>
+          <w:sz w:val="24"/>
+          <w:szCs w:val="24"/>
+          <w:lang w:val="en-US"/>
+        </w:rPr>
+        <w:t>regions</w:t>
+      </w:r>
+      <w:r>
+        <w:rPr>
+          <w:rFonts w:ascii="Times New Roman" w:hAnsi="Times New Roman" w:cs="Times New Roman"/>
+          <w:sz w:val="24"/>
+          <w:szCs w:val="24"/>
+        </w:rPr>
+        <w:t xml:space="preserve"> }</w:t>
+      </w:r>
+      <w:proofErr w:type="gramEnd"/>
+      <w:r>
+        <w:rPr>
+          <w:rFonts w:ascii="Times New Roman" w:hAnsi="Times New Roman" w:cs="Times New Roman"/>
+          <w:sz w:val="24"/>
+          <w:szCs w:val="24"/>
+        </w:rPr>
+        <w:t>}</w:t>
       </w:r>
     </w:p>
     <w:p>
@@ -1166,24 +1317,13 @@
       </w:pPr>
       <w:r>
         <w:rPr>
-          <w:rStyle w:val="hinttext"/>
-          <w:rFonts w:ascii="Times New Roman" w:hAnsi="Times New Roman" w:cs="Times New Roman"/>
-          <w:b/>
-          <w:bCs/>
-          <w:sz w:val="24"/>
-          <w:szCs w:val="24"/>
-        </w:rPr>
-        <w:t>Регионы обработки</w:t>
-      </w:r>
-      <w:r>
-        <w:rPr>
-          <w:rFonts w:ascii="Times New Roman" w:hAnsi="Times New Roman" w:cs="Times New Roman"/>
-          <w:b/>
-          <w:bCs/>
-          <w:sz w:val="24"/>
-          <w:szCs w:val="24"/>
-        </w:rPr>
-        <w:t>:</w:t>
+          <w:rFonts w:ascii="Times New Roman" w:hAnsi="Times New Roman" w:cs="Times New Roman"/>
+          <w:b/>
+          <w:bCs/>
+          <w:sz w:val="24"/>
+          <w:szCs w:val="24"/>
+        </w:rPr>
+        <w:t>ИНН:</w:t>
       </w:r>
       <w:r>
         <w:rPr>
@@ -1193,6 +1333,7 @@
         </w:rPr>
         <w:t xml:space="preserve"> </w:t>
       </w:r>
+      <w:proofErr w:type="gramStart"/>
       <w:r>
         <w:rPr>
           <w:rFonts w:ascii="Times New Roman" w:hAnsi="Times New Roman" w:cs="Times New Roman"/>
@@ -1208,25 +1349,9 @@
           <w:szCs w:val="24"/>
           <w:lang w:val="en-US"/>
         </w:rPr>
-        <w:t>org</w:t>
-      </w:r>
-      <w:r>
-        <w:rPr>
-          <w:rFonts w:ascii="Times New Roman" w:hAnsi="Times New Roman" w:cs="Times New Roman"/>
-          <w:sz w:val="24"/>
-          <w:szCs w:val="24"/>
-        </w:rPr>
-        <w:t>_</w:t>
-      </w:r>
-      <w:r>
-        <w:rPr>
-          <w:rFonts w:ascii="Times New Roman" w:hAnsi="Times New Roman" w:cs="Times New Roman"/>
-          <w:sz w:val="24"/>
-          <w:szCs w:val="24"/>
-          <w:lang w:val="en-US"/>
-        </w:rPr>
-        <w:t>regions</w:t>
-      </w:r>
+        <w:t>INN</w:t>
+      </w:r>
+      <w:proofErr w:type="gramEnd"/>
       <w:r>
         <w:rPr>
           <w:rFonts w:ascii="Times New Roman" w:hAnsi="Times New Roman" w:cs="Times New Roman"/>
@@ -1248,7 +1373,7 @@
           <w:sz w:val="24"/>
           <w:szCs w:val="24"/>
         </w:rPr>
-        <w:t>ИНН:</w:t>
+        <w:t>ОГРН:</w:t>
       </w:r>
       <w:r>
         <w:rPr>
@@ -1258,6 +1383,7 @@
         </w:rPr>
         <w:t xml:space="preserve"> </w:t>
       </w:r>
+      <w:proofErr w:type="gramStart"/>
       <w:r>
         <w:rPr>
           <w:rFonts w:ascii="Times New Roman" w:hAnsi="Times New Roman" w:cs="Times New Roman"/>
@@ -1273,8 +1399,9 @@
           <w:szCs w:val="24"/>
           <w:lang w:val="en-US"/>
         </w:rPr>
-        <w:t>INN</w:t>
-      </w:r>
+        <w:t>OGRN</w:t>
+      </w:r>
+      <w:proofErr w:type="gramEnd"/>
       <w:r>
         <w:rPr>
           <w:rFonts w:ascii="Times New Roman" w:hAnsi="Times New Roman" w:cs="Times New Roman"/>
@@ -1288,15 +1415,16 @@
       <w:pPr>
         <w:pStyle w:val="Standard"/>
       </w:pPr>
-      <w:r>
-        <w:rPr>
-          <w:rFonts w:ascii="Times New Roman" w:hAnsi="Times New Roman" w:cs="Times New Roman"/>
-          <w:b/>
-          <w:bCs/>
-          <w:sz w:val="24"/>
-          <w:szCs w:val="24"/>
-        </w:rPr>
-        <w:t>ОГРН:</w:t>
+      <w:proofErr w:type="gramStart"/>
+      <w:r>
+        <w:rPr>
+          <w:rFonts w:ascii="Times New Roman" w:hAnsi="Times New Roman" w:cs="Times New Roman"/>
+          <w:b/>
+          <w:bCs/>
+          <w:sz w:val="24"/>
+          <w:szCs w:val="24"/>
+        </w:rPr>
+        <w:t>ОКВЭД:</w:t>
       </w:r>
       <w:r>
         <w:rPr>
@@ -1312,24 +1440,52 @@
           <w:sz w:val="24"/>
           <w:szCs w:val="24"/>
         </w:rPr>
-        <w:t xml:space="preserve">{{ </w:t>
-      </w:r>
-      <w:r>
-        <w:rPr>
-          <w:rFonts w:ascii="Times New Roman" w:hAnsi="Times New Roman" w:cs="Times New Roman"/>
-          <w:sz w:val="24"/>
-          <w:szCs w:val="24"/>
-          <w:lang w:val="en-US"/>
-        </w:rPr>
-        <w:t>OGRN</w:t>
-      </w:r>
-      <w:r>
-        <w:rPr>
-          <w:rFonts w:ascii="Times New Roman" w:hAnsi="Times New Roman" w:cs="Times New Roman"/>
-          <w:sz w:val="24"/>
-          <w:szCs w:val="24"/>
-        </w:rPr>
-        <w:t xml:space="preserve"> }}</w:t>
+        <w:t xml:space="preserve"> {{ </w:t>
+      </w:r>
+      <w:r>
+        <w:rPr>
+          <w:rFonts w:ascii="Times New Roman" w:hAnsi="Times New Roman" w:cs="Times New Roman"/>
+          <w:sz w:val="24"/>
+          <w:szCs w:val="24"/>
+          <w:lang w:val="en-US"/>
+        </w:rPr>
+        <w:t>OKVED</w:t>
+      </w:r>
+      <w:proofErr w:type="gramEnd"/>
+      <w:r>
+        <w:rPr>
+          <w:rFonts w:ascii="Times New Roman" w:hAnsi="Times New Roman" w:cs="Times New Roman"/>
+          <w:sz w:val="24"/>
+          <w:szCs w:val="24"/>
+        </w:rPr>
+        <w:t>_</w:t>
+      </w:r>
+      <w:proofErr w:type="gramStart"/>
+      <w:r>
+        <w:rPr>
+          <w:rFonts w:ascii="Times New Roman" w:hAnsi="Times New Roman" w:cs="Times New Roman"/>
+          <w:sz w:val="24"/>
+          <w:szCs w:val="24"/>
+          <w:lang w:val="en-US"/>
+        </w:rPr>
+        <w:t>list</w:t>
+      </w:r>
+      <w:r>
+        <w:rPr>
+          <w:rFonts w:ascii="Times New Roman" w:hAnsi="Times New Roman" w:cs="Times New Roman"/>
+          <w:sz w:val="24"/>
+          <w:szCs w:val="24"/>
+        </w:rPr>
+        <w:t xml:space="preserve"> }</w:t>
+      </w:r>
+      <w:proofErr w:type="gramEnd"/>
+      <w:r>
+        <w:rPr>
+          <w:rFonts w:ascii="Times New Roman" w:hAnsi="Times New Roman" w:cs="Times New Roman"/>
+          <w:sz w:val="24"/>
+          <w:szCs w:val="24"/>
+        </w:rPr>
+        <w:t>}</w:t>
       </w:r>
     </w:p>
     <w:p>
@@ -1344,7 +1500,7 @@
           <w:sz w:val="24"/>
           <w:szCs w:val="24"/>
         </w:rPr>
-        <w:t>ОКВЭД:</w:t>
+        <w:t>ОКПО:</w:t>
       </w:r>
       <w:r>
         <w:rPr>
@@ -1354,40 +1510,25 @@
         </w:rPr>
         <w:t xml:space="preserve"> </w:t>
       </w:r>
-      <w:r>
-        <w:rPr>
-          <w:rFonts w:ascii="Times New Roman" w:hAnsi="Times New Roman" w:cs="Times New Roman"/>
-          <w:sz w:val="24"/>
-          <w:szCs w:val="24"/>
-        </w:rPr>
-        <w:t xml:space="preserve"> {{ </w:t>
-      </w:r>
-      <w:r>
-        <w:rPr>
-          <w:rFonts w:ascii="Times New Roman" w:hAnsi="Times New Roman" w:cs="Times New Roman"/>
-          <w:sz w:val="24"/>
-          <w:szCs w:val="24"/>
-          <w:lang w:val="en-US"/>
-        </w:rPr>
-        <w:t>OKVED</w:t>
-      </w:r>
-      <w:r>
-        <w:rPr>
-          <w:rFonts w:ascii="Times New Roman" w:hAnsi="Times New Roman" w:cs="Times New Roman"/>
-          <w:sz w:val="24"/>
-          <w:szCs w:val="24"/>
-        </w:rPr>
-        <w:t>_</w:t>
-      </w:r>
-      <w:r>
-        <w:rPr>
-          <w:rFonts w:ascii="Times New Roman" w:hAnsi="Times New Roman" w:cs="Times New Roman"/>
-          <w:sz w:val="24"/>
-          <w:szCs w:val="24"/>
-          <w:lang w:val="en-US"/>
-        </w:rPr>
-        <w:t>list</w:t>
-      </w:r>
+      <w:proofErr w:type="gramStart"/>
+      <w:r>
+        <w:rPr>
+          <w:rFonts w:ascii="Times New Roman" w:hAnsi="Times New Roman" w:cs="Times New Roman"/>
+          <w:sz w:val="24"/>
+          <w:szCs w:val="24"/>
+        </w:rPr>
+        <w:t xml:space="preserve">{{ </w:t>
+      </w:r>
+      <w:r>
+        <w:rPr>
+          <w:rFonts w:ascii="Times New Roman" w:hAnsi="Times New Roman" w:cs="Times New Roman"/>
+          <w:sz w:val="24"/>
+          <w:szCs w:val="24"/>
+          <w:lang w:val="en-US"/>
+        </w:rPr>
+        <w:t>OKPO</w:t>
+      </w:r>
+      <w:proofErr w:type="gramEnd"/>
       <w:r>
         <w:rPr>
           <w:rFonts w:ascii="Times New Roman" w:hAnsi="Times New Roman" w:cs="Times New Roman"/>
@@ -1409,7 +1550,7 @@
           <w:sz w:val="24"/>
           <w:szCs w:val="24"/>
         </w:rPr>
-        <w:t>ОКПО:</w:t>
+        <w:t>ОKФС:</w:t>
       </w:r>
       <w:r>
         <w:rPr>
@@ -1419,6 +1560,7 @@
         </w:rPr>
         <w:t xml:space="preserve"> </w:t>
       </w:r>
+      <w:proofErr w:type="gramStart"/>
       <w:r>
         <w:rPr>
           <w:rFonts w:ascii="Times New Roman" w:hAnsi="Times New Roman" w:cs="Times New Roman"/>
@@ -1434,8 +1576,9 @@
           <w:szCs w:val="24"/>
           <w:lang w:val="en-US"/>
         </w:rPr>
-        <w:t>OKPO</w:t>
-      </w:r>
+        <w:t>OKFS</w:t>
+      </w:r>
+      <w:proofErr w:type="gramEnd"/>
       <w:r>
         <w:rPr>
           <w:rFonts w:ascii="Times New Roman" w:hAnsi="Times New Roman" w:cs="Times New Roman"/>
@@ -1457,7 +1600,7 @@
           <w:sz w:val="24"/>
           <w:szCs w:val="24"/>
         </w:rPr>
-        <w:t>ОKФС:</w:t>
+        <w:t>ОКОГУ:</w:t>
       </w:r>
       <w:r>
         <w:rPr>
@@ -1467,6 +1610,7 @@
         </w:rPr>
         <w:t xml:space="preserve"> </w:t>
       </w:r>
+      <w:proofErr w:type="gramStart"/>
       <w:r>
         <w:rPr>
           <w:rFonts w:ascii="Times New Roman" w:hAnsi="Times New Roman" w:cs="Times New Roman"/>
@@ -1482,8 +1626,9 @@
           <w:szCs w:val="24"/>
           <w:lang w:val="en-US"/>
         </w:rPr>
-        <w:t>OKFS</w:t>
-      </w:r>
+        <w:t>OKOGY</w:t>
+      </w:r>
+      <w:proofErr w:type="gramEnd"/>
       <w:r>
         <w:rPr>
           <w:rFonts w:ascii="Times New Roman" w:hAnsi="Times New Roman" w:cs="Times New Roman"/>
@@ -1496,6 +1641,9 @@
     <w:p>
       <w:pPr>
         <w:pStyle w:val="Standard"/>
+        <w:rPr>
+          <w:lang w:val="en-US"/>
+        </w:rPr>
       </w:pPr>
       <w:r>
         <w:rPr>
@@ -1505,21 +1653,35 @@
           <w:sz w:val="24"/>
           <w:szCs w:val="24"/>
         </w:rPr>
-        <w:t>ОКОГУ:</w:t>
-      </w:r>
-      <w:r>
-        <w:rPr>
-          <w:rFonts w:ascii="Times New Roman" w:hAnsi="Times New Roman" w:cs="Times New Roman"/>
-          <w:sz w:val="24"/>
-          <w:szCs w:val="24"/>
+        <w:t>ОКОПФ</w:t>
+      </w:r>
+      <w:r>
+        <w:rPr>
+          <w:rFonts w:ascii="Times New Roman" w:hAnsi="Times New Roman" w:cs="Times New Roman"/>
+          <w:b/>
+          <w:bCs/>
+          <w:sz w:val="24"/>
+          <w:szCs w:val="24"/>
+          <w:lang w:val="en-US"/>
+        </w:rPr>
+        <w:t>:</w:t>
+      </w:r>
+      <w:r>
+        <w:rPr>
+          <w:rFonts w:ascii="Times New Roman" w:hAnsi="Times New Roman" w:cs="Times New Roman"/>
+          <w:sz w:val="24"/>
+          <w:szCs w:val="24"/>
+          <w:lang w:val="en-US"/>
         </w:rPr>
         <w:t xml:space="preserve"> </w:t>
       </w:r>
-      <w:r>
-        <w:rPr>
-          <w:rFonts w:ascii="Times New Roman" w:hAnsi="Times New Roman" w:cs="Times New Roman"/>
-          <w:sz w:val="24"/>
-          <w:szCs w:val="24"/>
+      <w:proofErr w:type="gramStart"/>
+      <w:r>
+        <w:rPr>
+          <w:rFonts w:ascii="Times New Roman" w:hAnsi="Times New Roman" w:cs="Times New Roman"/>
+          <w:sz w:val="24"/>
+          <w:szCs w:val="24"/>
+          <w:lang w:val="en-US"/>
         </w:rPr>
         <w:t xml:space="preserve">{{ </w:t>
       </w:r>
@@ -1530,13 +1692,15 @@
           <w:szCs w:val="24"/>
           <w:lang w:val="en-US"/>
         </w:rPr>
-        <w:t>OKOGY</w:t>
-      </w:r>
-      <w:r>
-        <w:rPr>
-          <w:rFonts w:ascii="Times New Roman" w:hAnsi="Times New Roman" w:cs="Times New Roman"/>
-          <w:sz w:val="24"/>
-          <w:szCs w:val="24"/>
+        <w:t>OKOP</w:t>
+      </w:r>
+      <w:proofErr w:type="gramEnd"/>
+      <w:r>
+        <w:rPr>
+          <w:rFonts w:ascii="Times New Roman" w:hAnsi="Times New Roman" w:cs="Times New Roman"/>
+          <w:sz w:val="24"/>
+          <w:szCs w:val="24"/>
+          <w:lang w:val="en-US"/>
         </w:rPr>
         <w:t xml:space="preserve"> }}</w:t>
       </w:r>
@@ -1557,7 +1721,7 @@
           <w:szCs w:val="24"/>
         </w:rPr>
         <w:lastRenderedPageBreak/>
-        <w:t>ОКОПФ</w:t>
+        <w:t>Филиалы</w:t>
       </w:r>
       <w:r>
         <w:rPr>
@@ -1573,79 +1737,26 @@
       <w:r>
         <w:rPr>
           <w:rFonts w:ascii="Times New Roman" w:hAnsi="Times New Roman" w:cs="Times New Roman"/>
+          <w:b/>
+          <w:bCs/>
           <w:sz w:val="24"/>
           <w:szCs w:val="24"/>
           <w:lang w:val="en-US"/>
         </w:rPr>
         <w:t xml:space="preserve"> </w:t>
       </w:r>
-      <w:r>
-        <w:rPr>
-          <w:rFonts w:ascii="Times New Roman" w:hAnsi="Times New Roman" w:cs="Times New Roman"/>
+      <w:proofErr w:type="gramStart"/>
+      <w:r>
+        <w:rPr>
+          <w:rFonts w:ascii="Times New Roman" w:hAnsi="Times New Roman" w:cs="Times New Roman"/>
+          <w:b/>
+          <w:bCs/>
           <w:sz w:val="24"/>
           <w:szCs w:val="24"/>
           <w:lang w:val="en-US"/>
         </w:rPr>
         <w:t xml:space="preserve">{{ </w:t>
       </w:r>
-      <w:r>
-        <w:rPr>
-          <w:rFonts w:ascii="Times New Roman" w:hAnsi="Times New Roman" w:cs="Times New Roman"/>
-          <w:sz w:val="24"/>
-          <w:szCs w:val="24"/>
-          <w:lang w:val="en-US"/>
-        </w:rPr>
-        <w:t>OKOP</w:t>
-      </w:r>
-      <w:r>
-        <w:rPr>
-          <w:rFonts w:ascii="Times New Roman" w:hAnsi="Times New Roman" w:cs="Times New Roman"/>
-          <w:sz w:val="24"/>
-          <w:szCs w:val="24"/>
-          <w:lang w:val="en-US"/>
-        </w:rPr>
-        <w:t xml:space="preserve"> }}</w:t>
-      </w:r>
-    </w:p>
-    <w:p>
-      <w:pPr>
-        <w:pStyle w:val="Standard"/>
-        <w:rPr>
-          <w:lang w:val="en-US"/>
-        </w:rPr>
-      </w:pPr>
-      <w:r>
-        <w:rPr>
-          <w:rFonts w:ascii="Times New Roman" w:hAnsi="Times New Roman" w:cs="Times New Roman"/>
-          <w:b/>
-          <w:bCs/>
-          <w:sz w:val="24"/>
-          <w:szCs w:val="24"/>
-        </w:rPr>
-        <w:t>Филиалы</w:t>
-      </w:r>
-      <w:r>
-        <w:rPr>
-          <w:rFonts w:ascii="Times New Roman" w:hAnsi="Times New Roman" w:cs="Times New Roman"/>
-          <w:b/>
-          <w:bCs/>
-          <w:sz w:val="24"/>
-          <w:szCs w:val="24"/>
-          <w:lang w:val="en-US"/>
-        </w:rPr>
-        <w:t>:</w:t>
-      </w:r>
-      <w:r>
-        <w:rPr>
-          <w:rFonts w:ascii="Times New Roman" w:hAnsi="Times New Roman" w:cs="Times New Roman"/>
-          <w:b/>
-          <w:bCs/>
-          <w:sz w:val="24"/>
-          <w:szCs w:val="24"/>
-          <w:lang w:val="en-US"/>
-        </w:rPr>
-        <w:t xml:space="preserve"> {{ </w:t>
-      </w:r>
       <w:proofErr w:type="spellStart"/>
       <w:r>
         <w:rPr>
@@ -1658,6 +1769,7 @@
         </w:rPr>
         <w:t>branches</w:t>
       </w:r>
+      <w:proofErr w:type="gramEnd"/>
       <w:r>
         <w:rPr>
           <w:rFonts w:ascii="Times New Roman" w:hAnsi="Times New Roman" w:cs="Times New Roman"/>
@@ -1724,6 +1836,7 @@
         </w:rPr>
         <w:t>organization_</w:t>
       </w:r>
+      <w:proofErr w:type="gramStart"/>
       <w:r>
         <w:rPr>
           <w:rFonts w:ascii="Times New Roman" w:hAnsi="Times New Roman" w:cs="Times New Roman"/>
@@ -1745,7 +1858,19 @@
           <w:szCs w:val="24"/>
           <w:lang w:val="en-US"/>
         </w:rPr>
-        <w:t xml:space="preserve"> }}</w:t>
+        <w:t xml:space="preserve"> }</w:t>
+      </w:r>
+      <w:proofErr w:type="gramEnd"/>
+      <w:r>
+        <w:rPr>
+          <w:rFonts w:ascii="Times New Roman" w:hAnsi="Times New Roman" w:cs="Times New Roman"/>
+          <w:b/>
+          <w:bCs/>
+          <w:sz w:val="24"/>
+          <w:szCs w:val="24"/>
+          <w:lang w:val="en-US"/>
+        </w:rPr>
+        <w:t>}</w:t>
       </w:r>
     </w:p>
     <w:p>
@@ -1845,6 +1970,7 @@
                 <w:lang w:val="en-US" w:eastAsia="ru-RU"/>
               </w:rPr>
             </w:pPr>
+            <w:proofErr w:type="gramStart"/>
             <w:r>
               <w:rPr>
                 <w:rFonts w:ascii="Times New Roman" w:hAnsi="Times New Roman"/>
@@ -1862,7 +1988,27 @@
                 <w:szCs w:val="24"/>
                 <w:lang w:val="en-US" w:eastAsia="ru-RU"/>
               </w:rPr>
-              <w:t>process.process_name</w:t>
+              <w:t>process</w:t>
+            </w:r>
+            <w:proofErr w:type="gramEnd"/>
+            <w:r>
+              <w:rPr>
+                <w:rFonts w:ascii="Times New Roman" w:hAnsi="Times New Roman"/>
+                <w:sz w:val="24"/>
+                <w:szCs w:val="24"/>
+                <w:lang w:val="en-US" w:eastAsia="ru-RU"/>
+              </w:rPr>
+              <w:t>.process_</w:t>
+            </w:r>
+            <w:proofErr w:type="gramStart"/>
+            <w:r>
+              <w:rPr>
+                <w:rFonts w:ascii="Times New Roman" w:hAnsi="Times New Roman"/>
+                <w:sz w:val="24"/>
+                <w:szCs w:val="24"/>
+                <w:lang w:val="en-US" w:eastAsia="ru-RU"/>
+              </w:rPr>
+              <w:t>name</w:t>
             </w:r>
             <w:proofErr w:type="spellEnd"/>
             <w:r>
@@ -1872,7 +2018,17 @@
                 <w:szCs w:val="24"/>
                 <w:lang w:val="en-US" w:eastAsia="ru-RU"/>
               </w:rPr>
-              <w:t xml:space="preserve"> }}</w:t>
+              <w:t xml:space="preserve"> }</w:t>
+            </w:r>
+            <w:proofErr w:type="gramEnd"/>
+            <w:r>
+              <w:rPr>
+                <w:rFonts w:ascii="Times New Roman" w:hAnsi="Times New Roman"/>
+                <w:sz w:val="24"/>
+                <w:szCs w:val="24"/>
+                <w:lang w:val="en-US" w:eastAsia="ru-RU"/>
+              </w:rPr>
+              <w:t>}</w:t>
             </w:r>
           </w:p>
           <w:p>
@@ -1924,7 +2080,17 @@
                 <w:szCs w:val="24"/>
                 <w:lang w:val="en-US" w:eastAsia="ru-RU"/>
               </w:rPr>
-              <w:t xml:space="preserve">: {{ </w:t>
+              <w:t xml:space="preserve">: </w:t>
+            </w:r>
+            <w:proofErr w:type="gramStart"/>
+            <w:r>
+              <w:rPr>
+                <w:rFonts w:ascii="Times New Roman" w:hAnsi="Times New Roman"/>
+                <w:sz w:val="24"/>
+                <w:szCs w:val="24"/>
+                <w:lang w:val="en-US" w:eastAsia="ru-RU"/>
+              </w:rPr>
+              <w:t xml:space="preserve">{{ </w:t>
             </w:r>
             <w:proofErr w:type="spellStart"/>
             <w:r>
@@ -1934,7 +2100,27 @@
                 <w:szCs w:val="24"/>
                 <w:lang w:val="en-US" w:eastAsia="ru-RU"/>
               </w:rPr>
-              <w:t>process.purpose_of_processing</w:t>
+              <w:t>process</w:t>
+            </w:r>
+            <w:proofErr w:type="gramEnd"/>
+            <w:r>
+              <w:rPr>
+                <w:rFonts w:ascii="Times New Roman" w:hAnsi="Times New Roman"/>
+                <w:sz w:val="24"/>
+                <w:szCs w:val="24"/>
+                <w:lang w:val="en-US" w:eastAsia="ru-RU"/>
+              </w:rPr>
+              <w:t>.purpose_of_</w:t>
+            </w:r>
+            <w:proofErr w:type="gramStart"/>
+            <w:r>
+              <w:rPr>
+                <w:rFonts w:ascii="Times New Roman" w:hAnsi="Times New Roman"/>
+                <w:sz w:val="24"/>
+                <w:szCs w:val="24"/>
+                <w:lang w:val="en-US" w:eastAsia="ru-RU"/>
+              </w:rPr>
+              <w:t>processing</w:t>
             </w:r>
             <w:proofErr w:type="spellEnd"/>
             <w:r>
@@ -1944,7 +2130,17 @@
                 <w:szCs w:val="24"/>
                 <w:lang w:val="en-US" w:eastAsia="ru-RU"/>
               </w:rPr>
-              <w:t xml:space="preserve"> }}</w:t>
+              <w:t xml:space="preserve"> }</w:t>
+            </w:r>
+            <w:proofErr w:type="gramEnd"/>
+            <w:r>
+              <w:rPr>
+                <w:rFonts w:ascii="Times New Roman" w:hAnsi="Times New Roman"/>
+                <w:sz w:val="24"/>
+                <w:szCs w:val="24"/>
+                <w:lang w:val="en-US" w:eastAsia="ru-RU"/>
+              </w:rPr>
+              <w:t>}</w:t>
             </w:r>
           </w:p>
           <w:p>
@@ -1986,7 +2182,17 @@
                 <w:szCs w:val="24"/>
                 <w:lang w:eastAsia="ru-RU"/>
               </w:rPr>
-              <w:t xml:space="preserve">Персональные данные: {{ </w:t>
+              <w:t xml:space="preserve">Персональные данные: </w:t>
+            </w:r>
+            <w:proofErr w:type="gramStart"/>
+            <w:r>
+              <w:rPr>
+                <w:rFonts w:ascii="Times New Roman" w:hAnsi="Times New Roman"/>
+                <w:sz w:val="24"/>
+                <w:szCs w:val="24"/>
+                <w:lang w:eastAsia="ru-RU"/>
+              </w:rPr>
+              <w:t xml:space="preserve">{{ </w:t>
             </w:r>
             <w:r>
               <w:rPr>
@@ -1997,6 +2203,7 @@
               </w:rPr>
               <w:t>process</w:t>
             </w:r>
+            <w:proofErr w:type="gramEnd"/>
             <w:r>
               <w:rPr>
                 <w:rFonts w:ascii="Times New Roman" w:hAnsi="Times New Roman"/>
@@ -2026,6 +2233,7 @@
               </w:rPr>
               <w:t>_</w:t>
             </w:r>
+            <w:proofErr w:type="gramStart"/>
             <w:r>
               <w:rPr>
                 <w:rFonts w:ascii="Times New Roman" w:hAnsi="Times New Roman"/>
@@ -2042,7 +2250,17 @@
                 <w:szCs w:val="24"/>
                 <w:lang w:eastAsia="ru-RU"/>
               </w:rPr>
-              <w:t xml:space="preserve"> }}</w:t>
+              <w:t xml:space="preserve"> }</w:t>
+            </w:r>
+            <w:proofErr w:type="gramEnd"/>
+            <w:r>
+              <w:rPr>
+                <w:rFonts w:ascii="Times New Roman" w:hAnsi="Times New Roman"/>
+                <w:sz w:val="24"/>
+                <w:szCs w:val="24"/>
+                <w:lang w:eastAsia="ru-RU"/>
+              </w:rPr>
+              <w:t>}</w:t>
             </w:r>
           </w:p>
           <w:p>
@@ -2063,7 +2281,17 @@
                 <w:szCs w:val="24"/>
                 <w:lang w:eastAsia="ru-RU"/>
               </w:rPr>
-              <w:t xml:space="preserve">Специальные категории персональных данных: {{ </w:t>
+              <w:t xml:space="preserve">Специальные категории персональных данных: </w:t>
+            </w:r>
+            <w:proofErr w:type="gramStart"/>
+            <w:r>
+              <w:rPr>
+                <w:rFonts w:ascii="Times New Roman" w:hAnsi="Times New Roman"/>
+                <w:sz w:val="24"/>
+                <w:szCs w:val="24"/>
+                <w:lang w:eastAsia="ru-RU"/>
+              </w:rPr>
+              <w:t xml:space="preserve">{{ </w:t>
             </w:r>
             <w:r>
               <w:rPr>
@@ -2074,6 +2302,7 @@
               </w:rPr>
               <w:t>process</w:t>
             </w:r>
+            <w:proofErr w:type="gramEnd"/>
             <w:r>
               <w:rPr>
                 <w:rFonts w:ascii="Times New Roman" w:hAnsi="Times New Roman"/>
@@ -2121,6 +2350,7 @@
               </w:rPr>
               <w:t>_</w:t>
             </w:r>
+            <w:proofErr w:type="gramStart"/>
             <w:r>
               <w:rPr>
                 <w:rFonts w:ascii="Times New Roman" w:hAnsi="Times New Roman"/>
@@ -2137,7 +2367,17 @@
                 <w:szCs w:val="24"/>
                 <w:lang w:eastAsia="ru-RU"/>
               </w:rPr>
-              <w:t xml:space="preserve"> }}</w:t>
+              <w:t xml:space="preserve"> }</w:t>
+            </w:r>
+            <w:proofErr w:type="gramEnd"/>
+            <w:r>
+              <w:rPr>
+                <w:rFonts w:ascii="Times New Roman" w:hAnsi="Times New Roman"/>
+                <w:sz w:val="24"/>
+                <w:szCs w:val="24"/>
+                <w:lang w:eastAsia="ru-RU"/>
+              </w:rPr>
+              <w:t>}</w:t>
             </w:r>
           </w:p>
           <w:p>
@@ -2158,7 +2398,17 @@
                 <w:szCs w:val="24"/>
                 <w:lang w:eastAsia="ru-RU"/>
               </w:rPr>
-              <w:t xml:space="preserve">Биометрические персональные данные: {{ </w:t>
+              <w:t xml:space="preserve">Биометрические персональные данные: </w:t>
+            </w:r>
+            <w:proofErr w:type="gramStart"/>
+            <w:r>
+              <w:rPr>
+                <w:rFonts w:ascii="Times New Roman" w:hAnsi="Times New Roman"/>
+                <w:sz w:val="24"/>
+                <w:szCs w:val="24"/>
+                <w:lang w:eastAsia="ru-RU"/>
+              </w:rPr>
+              <w:t xml:space="preserve">{{ </w:t>
             </w:r>
             <w:r>
               <w:rPr>
@@ -2169,6 +2419,7 @@
               </w:rPr>
               <w:t>process</w:t>
             </w:r>
+            <w:proofErr w:type="gramEnd"/>
             <w:r>
               <w:rPr>
                 <w:rFonts w:ascii="Times New Roman" w:hAnsi="Times New Roman"/>
@@ -2216,6 +2467,7 @@
               </w:rPr>
               <w:t>_</w:t>
             </w:r>
+            <w:proofErr w:type="gramStart"/>
             <w:r>
               <w:rPr>
                 <w:rFonts w:ascii="Times New Roman" w:hAnsi="Times New Roman"/>
@@ -2232,7 +2484,17 @@
                 <w:szCs w:val="24"/>
                 <w:lang w:eastAsia="ru-RU"/>
               </w:rPr>
-              <w:t xml:space="preserve"> }}</w:t>
+              <w:t xml:space="preserve"> }</w:t>
+            </w:r>
+            <w:proofErr w:type="gramEnd"/>
+            <w:r>
+              <w:rPr>
+                <w:rFonts w:ascii="Times New Roman" w:hAnsi="Times New Roman"/>
+                <w:sz w:val="24"/>
+                <w:szCs w:val="24"/>
+                <w:lang w:eastAsia="ru-RU"/>
+              </w:rPr>
+              <w:t>}</w:t>
             </w:r>
           </w:p>
           <w:p>
@@ -2253,7 +2515,17 @@
                 <w:szCs w:val="24"/>
                 <w:lang w:eastAsia="ru-RU"/>
               </w:rPr>
-              <w:t xml:space="preserve">Категории субъектов, персональные данные которых обрабатываются: {{ </w:t>
+              <w:t xml:space="preserve">Категории субъектов, персональные данные которых обрабатываются: </w:t>
+            </w:r>
+            <w:proofErr w:type="gramStart"/>
+            <w:r>
+              <w:rPr>
+                <w:rFonts w:ascii="Times New Roman" w:hAnsi="Times New Roman"/>
+                <w:sz w:val="24"/>
+                <w:szCs w:val="24"/>
+                <w:lang w:eastAsia="ru-RU"/>
+              </w:rPr>
+              <w:t xml:space="preserve">{{ </w:t>
             </w:r>
             <w:r>
               <w:rPr>
@@ -2264,6 +2536,7 @@
               </w:rPr>
               <w:t>process</w:t>
             </w:r>
+            <w:proofErr w:type="gramEnd"/>
             <w:r>
               <w:rPr>
                 <w:rFonts w:ascii="Times New Roman" w:hAnsi="Times New Roman"/>
@@ -2310,6 +2583,7 @@
               <w:t>_</w:t>
             </w:r>
             <w:proofErr w:type="spellStart"/>
+            <w:proofErr w:type="gramStart"/>
             <w:r>
               <w:rPr>
                 <w:rFonts w:ascii="Times New Roman" w:hAnsi="Times New Roman"/>
@@ -2327,7 +2601,17 @@
                 <w:szCs w:val="24"/>
                 <w:lang w:eastAsia="ru-RU"/>
               </w:rPr>
-              <w:t xml:space="preserve"> }}</w:t>
+              <w:t xml:space="preserve"> }</w:t>
+            </w:r>
+            <w:proofErr w:type="gramEnd"/>
+            <w:r>
+              <w:rPr>
+                <w:rFonts w:ascii="Times New Roman" w:hAnsi="Times New Roman"/>
+                <w:sz w:val="24"/>
+                <w:szCs w:val="24"/>
+                <w:lang w:eastAsia="ru-RU"/>
+              </w:rPr>
+              <w:t>}</w:t>
             </w:r>
           </w:p>
           <w:p>
@@ -2348,7 +2632,17 @@
                 <w:szCs w:val="24"/>
                 <w:lang w:eastAsia="ru-RU"/>
               </w:rPr>
-              <w:t xml:space="preserve">Правовое основание обработки персональных данных: {{ </w:t>
+              <w:t xml:space="preserve">Правовое основание обработки персональных данных: </w:t>
+            </w:r>
+            <w:proofErr w:type="gramStart"/>
+            <w:r>
+              <w:rPr>
+                <w:rFonts w:ascii="Times New Roman" w:hAnsi="Times New Roman"/>
+                <w:sz w:val="24"/>
+                <w:szCs w:val="24"/>
+                <w:lang w:eastAsia="ru-RU"/>
+              </w:rPr>
+              <w:t xml:space="preserve">{{ </w:t>
             </w:r>
             <w:r>
               <w:rPr>
@@ -2359,6 +2653,7 @@
               </w:rPr>
               <w:t>process</w:t>
             </w:r>
+            <w:proofErr w:type="gramEnd"/>
             <w:r>
               <w:rPr>
                 <w:rFonts w:ascii="Times New Roman" w:hAnsi="Times New Roman"/>
@@ -2386,6 +2681,7 @@
               </w:rPr>
               <w:t>_</w:t>
             </w:r>
+            <w:proofErr w:type="gramStart"/>
             <w:r>
               <w:rPr>
                 <w:rFonts w:ascii="Times New Roman" w:hAnsi="Times New Roman"/>
@@ -2402,7 +2698,17 @@
                 <w:szCs w:val="24"/>
                 <w:lang w:eastAsia="ru-RU"/>
               </w:rPr>
-              <w:t xml:space="preserve"> }}</w:t>
+              <w:t xml:space="preserve"> }</w:t>
+            </w:r>
+            <w:proofErr w:type="gramEnd"/>
+            <w:r>
+              <w:rPr>
+                <w:rFonts w:ascii="Times New Roman" w:hAnsi="Times New Roman"/>
+                <w:sz w:val="24"/>
+                <w:szCs w:val="24"/>
+                <w:lang w:eastAsia="ru-RU"/>
+              </w:rPr>
+              <w:t>}</w:t>
             </w:r>
           </w:p>
           <w:p>
@@ -2423,7 +2729,17 @@
                 <w:szCs w:val="24"/>
                 <w:lang w:eastAsia="ru-RU"/>
               </w:rPr>
-              <w:t xml:space="preserve">Перечень действий: {{ </w:t>
+              <w:t xml:space="preserve">Перечень действий: </w:t>
+            </w:r>
+            <w:proofErr w:type="gramStart"/>
+            <w:r>
+              <w:rPr>
+                <w:rFonts w:ascii="Times New Roman" w:hAnsi="Times New Roman"/>
+                <w:sz w:val="24"/>
+                <w:szCs w:val="24"/>
+                <w:lang w:eastAsia="ru-RU"/>
+              </w:rPr>
+              <w:t xml:space="preserve">{{ </w:t>
             </w:r>
             <w:r>
               <w:rPr>
@@ -2434,6 +2750,7 @@
               </w:rPr>
               <w:t>process</w:t>
             </w:r>
+            <w:proofErr w:type="gramEnd"/>
             <w:r>
               <w:rPr>
                 <w:rFonts w:ascii="Times New Roman" w:hAnsi="Times New Roman"/>
@@ -2480,6 +2797,7 @@
               <w:t>_</w:t>
             </w:r>
             <w:proofErr w:type="spellStart"/>
+            <w:proofErr w:type="gramStart"/>
             <w:r>
               <w:rPr>
                 <w:rFonts w:ascii="Times New Roman" w:hAnsi="Times New Roman"/>
@@ -2497,7 +2815,17 @@
                 <w:szCs w:val="24"/>
                 <w:lang w:eastAsia="ru-RU"/>
               </w:rPr>
-              <w:t xml:space="preserve"> }}</w:t>
+              <w:t xml:space="preserve"> }</w:t>
+            </w:r>
+            <w:proofErr w:type="gramEnd"/>
+            <w:r>
+              <w:rPr>
+                <w:rFonts w:ascii="Times New Roman" w:hAnsi="Times New Roman"/>
+                <w:sz w:val="24"/>
+                <w:szCs w:val="24"/>
+                <w:lang w:eastAsia="ru-RU"/>
+              </w:rPr>
+              <w:t>}</w:t>
             </w:r>
           </w:p>
           <w:p>
@@ -2516,7 +2844,17 @@
                 <w:szCs w:val="24"/>
                 <w:lang w:eastAsia="ru-RU"/>
               </w:rPr>
-              <w:t xml:space="preserve">Способы обработки: {{ </w:t>
+              <w:t xml:space="preserve">Способы обработки: </w:t>
+            </w:r>
+            <w:proofErr w:type="gramStart"/>
+            <w:r>
+              <w:rPr>
+                <w:rFonts w:ascii="Times New Roman" w:hAnsi="Times New Roman"/>
+                <w:sz w:val="24"/>
+                <w:szCs w:val="24"/>
+                <w:lang w:eastAsia="ru-RU"/>
+              </w:rPr>
+              <w:t xml:space="preserve">{{ </w:t>
             </w:r>
             <w:r>
               <w:rPr>
@@ -2527,6 +2865,7 @@
               </w:rPr>
               <w:t>process</w:t>
             </w:r>
+            <w:proofErr w:type="gramEnd"/>
             <w:r>
               <w:rPr>
                 <w:rFonts w:ascii="Times New Roman" w:hAnsi="Times New Roman"/>
@@ -2698,6 +3037,7 @@
       <w:r>
         <w:t xml:space="preserve"> </w:t>
       </w:r>
+      <w:proofErr w:type="gramStart"/>
       <w:r>
         <w:rPr>
           <w:rFonts w:ascii="Times New Roman" w:hAnsi="Times New Roman"/>
@@ -2716,6 +3056,7 @@
         </w:rPr>
         <w:t>security</w:t>
       </w:r>
+      <w:proofErr w:type="gramEnd"/>
       <w:r>
         <w:rPr>
           <w:rFonts w:ascii="Times New Roman" w:hAnsi="Times New Roman"/>
@@ -2726,6 +3067,7 @@
         <w:t>_</w:t>
       </w:r>
       <w:proofErr w:type="spellStart"/>
+      <w:proofErr w:type="gramStart"/>
       <w:r>
         <w:rPr>
           <w:rFonts w:ascii="Times New Roman" w:hAnsi="Times New Roman"/>
@@ -2743,7 +3085,17 @@
           <w:szCs w:val="24"/>
           <w:lang w:eastAsia="ru-RU"/>
         </w:rPr>
-        <w:t xml:space="preserve"> }}</w:t>
+        <w:t xml:space="preserve"> }</w:t>
+      </w:r>
+      <w:proofErr w:type="gramEnd"/>
+      <w:r>
+        <w:rPr>
+          <w:rFonts w:ascii="Times New Roman" w:hAnsi="Times New Roman"/>
+          <w:sz w:val="24"/>
+          <w:szCs w:val="24"/>
+          <w:lang w:eastAsia="ru-RU"/>
+        </w:rPr>
+        <w:t>}</w:t>
       </w:r>
     </w:p>
     <w:p>
@@ -2783,6 +3135,7 @@
         </w:rPr>
         <w:t xml:space="preserve">: </w:t>
       </w:r>
+      <w:proofErr w:type="gramStart"/>
       <w:r>
         <w:rPr>
           <w:rFonts w:ascii="Times New Roman" w:hAnsi="Times New Roman" w:cs="Times New Roman"/>
@@ -2798,7 +3151,16 @@
           <w:sz w:val="24"/>
           <w:szCs w:val="24"/>
         </w:rPr>
-        <w:t>is_using_SKZI</w:t>
+        <w:t>is</w:t>
+      </w:r>
+      <w:proofErr w:type="gramEnd"/>
+      <w:r>
+        <w:rPr>
+          <w:rFonts w:ascii="Times New Roman" w:hAnsi="Times New Roman" w:cs="Times New Roman"/>
+          <w:sz w:val="24"/>
+          <w:szCs w:val="24"/>
+        </w:rPr>
+        <w:t>_using_SKZI</w:t>
       </w:r>
       <w:proofErr w:type="spellEnd"/>
       <w:r>
@@ -2816,6 +3178,14 @@
           <w:szCs w:val="24"/>
         </w:rPr>
         <w:br/>
+      </w:r>
+      <w:proofErr w:type="gramStart"/>
+      <w:r>
+        <w:rPr>
+          <w:rFonts w:ascii="Times New Roman" w:hAnsi="Times New Roman" w:cs="Times New Roman"/>
+          <w:sz w:val="24"/>
+          <w:szCs w:val="24"/>
+        </w:rPr>
         <w:t xml:space="preserve">{{ </w:t>
       </w:r>
       <w:proofErr w:type="spellStart"/>
@@ -2825,7 +3195,25 @@
           <w:sz w:val="24"/>
           <w:szCs w:val="24"/>
         </w:rPr>
-        <w:t>SKZI_block</w:t>
+        <w:t>SKZI</w:t>
+      </w:r>
+      <w:proofErr w:type="gramEnd"/>
+      <w:r>
+        <w:rPr>
+          <w:rFonts w:ascii="Times New Roman" w:hAnsi="Times New Roman" w:cs="Times New Roman"/>
+          <w:sz w:val="24"/>
+          <w:szCs w:val="24"/>
+        </w:rPr>
+        <w:t>_</w:t>
+      </w:r>
+      <w:proofErr w:type="gramStart"/>
+      <w:r>
+        <w:rPr>
+          <w:rFonts w:ascii="Times New Roman" w:hAnsi="Times New Roman" w:cs="Times New Roman"/>
+          <w:sz w:val="24"/>
+          <w:szCs w:val="24"/>
+        </w:rPr>
+        <w:t>block</w:t>
       </w:r>
       <w:proofErr w:type="spellEnd"/>
       <w:r>
@@ -2834,7 +3222,16 @@
           <w:sz w:val="24"/>
           <w:szCs w:val="24"/>
         </w:rPr>
-        <w:t xml:space="preserve"> }}</w:t>
+        <w:t xml:space="preserve"> }</w:t>
+      </w:r>
+      <w:proofErr w:type="gramEnd"/>
+      <w:r>
+        <w:rPr>
+          <w:rFonts w:ascii="Times New Roman" w:hAnsi="Times New Roman" w:cs="Times New Roman"/>
+          <w:sz w:val="24"/>
+          <w:szCs w:val="24"/>
+        </w:rPr>
+        <w:t>}</w:t>
       </w:r>
     </w:p>
     <w:p>
@@ -2843,8 +3240,6 @@
         <w:rPr>
           <w:rStyle w:val="hinttext"/>
           <w:rFonts w:ascii="Times New Roman" w:hAnsi="Times New Roman" w:cs="Times New Roman"/>
-          <w:b/>
-          <w:bCs/>
           <w:sz w:val="24"/>
           <w:szCs w:val="24"/>
         </w:rPr>
@@ -2858,32 +3253,67 @@
           <w:sz w:val="24"/>
           <w:szCs w:val="24"/>
         </w:rPr>
-        <w:lastRenderedPageBreak/>
-        <w:t xml:space="preserve">Ответственный за организацию обработки персональных данных: {{ </w:t>
+        <w:t xml:space="preserve">Ответственный за организацию обработки персональных данных: </w:t>
+      </w:r>
+      <w:proofErr w:type="gramStart"/>
+      <w:r>
+        <w:rPr>
+          <w:rStyle w:val="hinttext"/>
+          <w:rFonts w:ascii="Times New Roman" w:hAnsi="Times New Roman" w:cs="Times New Roman"/>
+          <w:sz w:val="24"/>
+          <w:szCs w:val="24"/>
+        </w:rPr>
+        <w:t xml:space="preserve">{{ </w:t>
       </w:r>
       <w:proofErr w:type="spellStart"/>
       <w:r>
         <w:rPr>
           <w:rStyle w:val="hinttext"/>
           <w:rFonts w:ascii="Times New Roman" w:hAnsi="Times New Roman" w:cs="Times New Roman"/>
-          <w:b/>
-          <w:bCs/>
-          <w:sz w:val="24"/>
-          <w:szCs w:val="24"/>
-        </w:rPr>
-        <w:t>employee_responsible_for_PDn</w:t>
+          <w:sz w:val="24"/>
+          <w:szCs w:val="24"/>
+        </w:rPr>
+        <w:t>employee</w:t>
+      </w:r>
+      <w:proofErr w:type="gramEnd"/>
+      <w:r>
+        <w:rPr>
+          <w:rStyle w:val="hinttext"/>
+          <w:rFonts w:ascii="Times New Roman" w:hAnsi="Times New Roman" w:cs="Times New Roman"/>
+          <w:sz w:val="24"/>
+          <w:szCs w:val="24"/>
+        </w:rPr>
+        <w:t>_responsible_for_</w:t>
+      </w:r>
+      <w:proofErr w:type="gramStart"/>
+      <w:r>
+        <w:rPr>
+          <w:rStyle w:val="hinttext"/>
+          <w:rFonts w:ascii="Times New Roman" w:hAnsi="Times New Roman" w:cs="Times New Roman"/>
+          <w:sz w:val="24"/>
+          <w:szCs w:val="24"/>
+        </w:rPr>
+        <w:t>PDn</w:t>
       </w:r>
       <w:proofErr w:type="spellEnd"/>
       <w:r>
         <w:rPr>
           <w:rStyle w:val="hinttext"/>
           <w:rFonts w:ascii="Times New Roman" w:hAnsi="Times New Roman" w:cs="Times New Roman"/>
-          <w:b/>
-          <w:bCs/>
-          <w:sz w:val="24"/>
-          <w:szCs w:val="24"/>
-        </w:rPr>
-        <w:t xml:space="preserve"> }}</w:t>
+          <w:sz w:val="24"/>
+          <w:szCs w:val="24"/>
+        </w:rPr>
+        <w:t xml:space="preserve"> }</w:t>
+      </w:r>
+      <w:proofErr w:type="gramEnd"/>
+      <w:r>
+        <w:rPr>
+          <w:rStyle w:val="hinttext"/>
+          <w:rFonts w:ascii="Times New Roman" w:hAnsi="Times New Roman" w:cs="Times New Roman"/>
+          <w:sz w:val="24"/>
+          <w:szCs w:val="24"/>
+        </w:rPr>
+        <w:t>}</w:t>
       </w:r>
     </w:p>
     <w:p>
@@ -2908,6 +3338,7 @@
           <w:sz w:val="24"/>
           <w:szCs w:val="24"/>
         </w:rPr>
+        <w:lastRenderedPageBreak/>
         <w:t>Почтовый</w:t>
       </w:r>
       <w:r>
@@ -2943,33 +3374,73 @@
           <w:szCs w:val="24"/>
           <w:lang w:val="en-US"/>
         </w:rPr>
-        <w:t xml:space="preserve">: {{ </w:t>
+        <w:t xml:space="preserve">: </w:t>
+      </w:r>
+      <w:proofErr w:type="gramStart"/>
+      <w:r>
+        <w:rPr>
+          <w:rStyle w:val="hinttext"/>
+          <w:rFonts w:ascii="Times New Roman" w:hAnsi="Times New Roman" w:cs="Times New Roman"/>
+          <w:sz w:val="24"/>
+          <w:szCs w:val="24"/>
+          <w:lang w:val="en-US"/>
+        </w:rPr>
+        <w:t xml:space="preserve">{{ </w:t>
       </w:r>
       <w:proofErr w:type="spellStart"/>
       <w:r>
         <w:rPr>
           <w:rStyle w:val="hinttext"/>
           <w:rFonts w:ascii="Times New Roman" w:hAnsi="Times New Roman" w:cs="Times New Roman"/>
-          <w:b/>
-          <w:bCs/>
-          <w:sz w:val="24"/>
-          <w:szCs w:val="24"/>
-          <w:lang w:val="en-US"/>
-        </w:rPr>
-        <w:t>employee_responsible_for_PDn_adress</w:t>
+          <w:sz w:val="24"/>
+          <w:szCs w:val="24"/>
+          <w:lang w:val="en-US"/>
+        </w:rPr>
+        <w:t>employee</w:t>
+      </w:r>
+      <w:proofErr w:type="gramEnd"/>
+      <w:r>
+        <w:rPr>
+          <w:rStyle w:val="hinttext"/>
+          <w:rFonts w:ascii="Times New Roman" w:hAnsi="Times New Roman" w:cs="Times New Roman"/>
+          <w:sz w:val="24"/>
+          <w:szCs w:val="24"/>
+          <w:lang w:val="en-US"/>
+        </w:rPr>
+        <w:t>_responsible_for_PDn_</w:t>
+      </w:r>
+      <w:proofErr w:type="gramStart"/>
+      <w:r>
+        <w:rPr>
+          <w:rStyle w:val="hinttext"/>
+          <w:rFonts w:ascii="Times New Roman" w:hAnsi="Times New Roman" w:cs="Times New Roman"/>
+          <w:sz w:val="24"/>
+          <w:szCs w:val="24"/>
+          <w:lang w:val="en-US"/>
+        </w:rPr>
+        <w:t>adress</w:t>
       </w:r>
       <w:proofErr w:type="spellEnd"/>
       <w:r>
         <w:rPr>
           <w:rStyle w:val="hinttext"/>
           <w:rFonts w:ascii="Times New Roman" w:hAnsi="Times New Roman" w:cs="Times New Roman"/>
-          <w:b/>
-          <w:bCs/>
-          <w:sz w:val="24"/>
-          <w:szCs w:val="24"/>
-          <w:lang w:val="en-US"/>
-        </w:rPr>
-        <w:t xml:space="preserve"> }}</w:t>
+          <w:sz w:val="24"/>
+          <w:szCs w:val="24"/>
+          <w:lang w:val="en-US"/>
+        </w:rPr>
+        <w:t xml:space="preserve"> }</w:t>
+      </w:r>
+      <w:proofErr w:type="gramEnd"/>
+      <w:r>
+        <w:rPr>
+          <w:rStyle w:val="hinttext"/>
+          <w:rFonts w:ascii="Times New Roman" w:hAnsi="Times New Roman" w:cs="Times New Roman"/>
+          <w:sz w:val="24"/>
+          <w:szCs w:val="24"/>
+          <w:lang w:val="en-US"/>
+        </w:rPr>
+        <w:t>}</w:t>
       </w:r>
     </w:p>
     <w:p>
@@ -3052,33 +3523,73 @@
           <w:szCs w:val="24"/>
           <w:lang w:val="en-US"/>
         </w:rPr>
-        <w:t xml:space="preserve">: {{ </w:t>
+        <w:t xml:space="preserve">: </w:t>
+      </w:r>
+      <w:proofErr w:type="gramStart"/>
+      <w:r>
+        <w:rPr>
+          <w:rStyle w:val="hinttext"/>
+          <w:rFonts w:ascii="Times New Roman" w:hAnsi="Times New Roman" w:cs="Times New Roman"/>
+          <w:sz w:val="24"/>
+          <w:szCs w:val="24"/>
+          <w:lang w:val="en-US"/>
+        </w:rPr>
+        <w:t xml:space="preserve">{{ </w:t>
       </w:r>
       <w:proofErr w:type="spellStart"/>
       <w:r>
         <w:rPr>
           <w:rStyle w:val="hinttext"/>
           <w:rFonts w:ascii="Times New Roman" w:hAnsi="Times New Roman" w:cs="Times New Roman"/>
-          <w:b/>
-          <w:bCs/>
-          <w:sz w:val="24"/>
-          <w:szCs w:val="24"/>
-          <w:lang w:val="en-US"/>
-        </w:rPr>
-        <w:t>employee_responsible_for_PDn_phones</w:t>
+          <w:sz w:val="24"/>
+          <w:szCs w:val="24"/>
+          <w:lang w:val="en-US"/>
+        </w:rPr>
+        <w:t>employee</w:t>
+      </w:r>
+      <w:proofErr w:type="gramEnd"/>
+      <w:r>
+        <w:rPr>
+          <w:rStyle w:val="hinttext"/>
+          <w:rFonts w:ascii="Times New Roman" w:hAnsi="Times New Roman" w:cs="Times New Roman"/>
+          <w:sz w:val="24"/>
+          <w:szCs w:val="24"/>
+          <w:lang w:val="en-US"/>
+        </w:rPr>
+        <w:t>_responsible_for_PDn_</w:t>
+      </w:r>
+      <w:proofErr w:type="gramStart"/>
+      <w:r>
+        <w:rPr>
+          <w:rStyle w:val="hinttext"/>
+          <w:rFonts w:ascii="Times New Roman" w:hAnsi="Times New Roman" w:cs="Times New Roman"/>
+          <w:sz w:val="24"/>
+          <w:szCs w:val="24"/>
+          <w:lang w:val="en-US"/>
+        </w:rPr>
+        <w:t>phones</w:t>
       </w:r>
       <w:proofErr w:type="spellEnd"/>
       <w:r>
         <w:rPr>
           <w:rStyle w:val="hinttext"/>
           <w:rFonts w:ascii="Times New Roman" w:hAnsi="Times New Roman" w:cs="Times New Roman"/>
-          <w:b/>
-          <w:bCs/>
-          <w:sz w:val="24"/>
-          <w:szCs w:val="24"/>
-          <w:lang w:val="en-US"/>
-        </w:rPr>
-        <w:t xml:space="preserve"> }}</w:t>
+          <w:sz w:val="24"/>
+          <w:szCs w:val="24"/>
+          <w:lang w:val="en-US"/>
+        </w:rPr>
+        <w:t xml:space="preserve"> }</w:t>
+      </w:r>
+      <w:proofErr w:type="gramEnd"/>
+      <w:r>
+        <w:rPr>
+          <w:rStyle w:val="hinttext"/>
+          <w:rFonts w:ascii="Times New Roman" w:hAnsi="Times New Roman" w:cs="Times New Roman"/>
+          <w:sz w:val="24"/>
+          <w:szCs w:val="24"/>
+          <w:lang w:val="en-US"/>
+        </w:rPr>
+        <w:t>}</w:t>
       </w:r>
     </w:p>
     <w:p>
@@ -3161,33 +3672,73 @@
           <w:szCs w:val="24"/>
           <w:lang w:val="en-US"/>
         </w:rPr>
-        <w:t xml:space="preserve">: {{ </w:t>
+        <w:t xml:space="preserve">: </w:t>
+      </w:r>
+      <w:proofErr w:type="gramStart"/>
+      <w:r>
+        <w:rPr>
+          <w:rStyle w:val="hinttext"/>
+          <w:rFonts w:ascii="Times New Roman" w:hAnsi="Times New Roman" w:cs="Times New Roman"/>
+          <w:sz w:val="24"/>
+          <w:szCs w:val="24"/>
+          <w:lang w:val="en-US"/>
+        </w:rPr>
+        <w:t xml:space="preserve">{{ </w:t>
       </w:r>
       <w:proofErr w:type="spellStart"/>
       <w:r>
         <w:rPr>
           <w:rStyle w:val="hinttext"/>
           <w:rFonts w:ascii="Times New Roman" w:hAnsi="Times New Roman" w:cs="Times New Roman"/>
-          <w:b/>
-          <w:bCs/>
-          <w:sz w:val="24"/>
-          <w:szCs w:val="24"/>
-          <w:lang w:val="en-US"/>
-        </w:rPr>
-        <w:t>employee_responsible_for_PDn_emails</w:t>
+          <w:sz w:val="24"/>
+          <w:szCs w:val="24"/>
+          <w:lang w:val="en-US"/>
+        </w:rPr>
+        <w:t>employee</w:t>
+      </w:r>
+      <w:proofErr w:type="gramEnd"/>
+      <w:r>
+        <w:rPr>
+          <w:rStyle w:val="hinttext"/>
+          <w:rFonts w:ascii="Times New Roman" w:hAnsi="Times New Roman" w:cs="Times New Roman"/>
+          <w:sz w:val="24"/>
+          <w:szCs w:val="24"/>
+          <w:lang w:val="en-US"/>
+        </w:rPr>
+        <w:t>_responsible_for_PDn_</w:t>
+      </w:r>
+      <w:proofErr w:type="gramStart"/>
+      <w:r>
+        <w:rPr>
+          <w:rStyle w:val="hinttext"/>
+          <w:rFonts w:ascii="Times New Roman" w:hAnsi="Times New Roman" w:cs="Times New Roman"/>
+          <w:sz w:val="24"/>
+          <w:szCs w:val="24"/>
+          <w:lang w:val="en-US"/>
+        </w:rPr>
+        <w:t>emails</w:t>
       </w:r>
       <w:proofErr w:type="spellEnd"/>
       <w:r>
         <w:rPr>
           <w:rStyle w:val="hinttext"/>
           <w:rFonts w:ascii="Times New Roman" w:hAnsi="Times New Roman" w:cs="Times New Roman"/>
-          <w:b/>
-          <w:bCs/>
-          <w:sz w:val="24"/>
-          <w:szCs w:val="24"/>
-          <w:lang w:val="en-US"/>
-        </w:rPr>
-        <w:t xml:space="preserve"> }}</w:t>
+          <w:sz w:val="24"/>
+          <w:szCs w:val="24"/>
+          <w:lang w:val="en-US"/>
+        </w:rPr>
+        <w:t xml:space="preserve"> }</w:t>
+      </w:r>
+      <w:proofErr w:type="gramEnd"/>
+      <w:r>
+        <w:rPr>
+          <w:rStyle w:val="hinttext"/>
+          <w:rFonts w:ascii="Times New Roman" w:hAnsi="Times New Roman" w:cs="Times New Roman"/>
+          <w:sz w:val="24"/>
+          <w:szCs w:val="24"/>
+          <w:lang w:val="en-US"/>
+        </w:rPr>
+        <w:t>}</w:t>
       </w:r>
     </w:p>
     <w:p>
@@ -3313,6 +3864,7 @@
         </w:rPr>
         <w:t xml:space="preserve"> </w:t>
       </w:r>
+      <w:proofErr w:type="gramStart"/>
       <w:r>
         <w:rPr>
           <w:rStyle w:val="hinttext"/>
@@ -3332,6 +3884,7 @@
         </w:rPr>
         <w:t>start</w:t>
       </w:r>
+      <w:proofErr w:type="gramEnd"/>
       <w:r>
         <w:rPr>
           <w:rStyle w:val="hinttext"/>
@@ -3362,6 +3915,7 @@
         </w:rPr>
         <w:t>_</w:t>
       </w:r>
+      <w:proofErr w:type="gramStart"/>
       <w:r>
         <w:rPr>
           <w:rStyle w:val="hinttext"/>
@@ -3379,7 +3933,17 @@
           <w:sz w:val="24"/>
           <w:szCs w:val="24"/>
         </w:rPr>
-        <w:t xml:space="preserve"> }}</w:t>
+        <w:t xml:space="preserve"> }</w:t>
+      </w:r>
+      <w:proofErr w:type="gramEnd"/>
+      <w:r>
+        <w:rPr>
+          <w:rStyle w:val="hinttext"/>
+          <w:rFonts w:ascii="Times New Roman" w:hAnsi="Times New Roman"/>
+          <w:sz w:val="24"/>
+          <w:szCs w:val="24"/>
+        </w:rPr>
+        <w:t>}</w:t>
       </w:r>
     </w:p>
     <w:p>
@@ -3549,6 +4113,7 @@
         </w:rPr>
         <w:t xml:space="preserve"> </w:t>
       </w:r>
+      <w:proofErr w:type="gramStart"/>
       <w:r>
         <w:rPr>
           <w:rFonts w:ascii="Times New Roman" w:hAnsi="Times New Roman" w:cs="Times New Roman"/>
@@ -3564,7 +4129,25 @@
           <w:sz w:val="24"/>
           <w:szCs w:val="24"/>
         </w:rPr>
-        <w:t>termination_text</w:t>
+        <w:t>termination</w:t>
+      </w:r>
+      <w:proofErr w:type="gramEnd"/>
+      <w:r>
+        <w:rPr>
+          <w:rFonts w:ascii="Times New Roman" w:hAnsi="Times New Roman" w:cs="Times New Roman"/>
+          <w:sz w:val="24"/>
+          <w:szCs w:val="24"/>
+        </w:rPr>
+        <w:t>_</w:t>
+      </w:r>
+      <w:proofErr w:type="gramStart"/>
+      <w:r>
+        <w:rPr>
+          <w:rFonts w:ascii="Times New Roman" w:hAnsi="Times New Roman" w:cs="Times New Roman"/>
+          <w:sz w:val="24"/>
+          <w:szCs w:val="24"/>
+        </w:rPr>
+        <w:t>text</w:t>
       </w:r>
       <w:proofErr w:type="spellEnd"/>
       <w:r>
@@ -3573,7 +4156,16 @@
           <w:sz w:val="24"/>
           <w:szCs w:val="24"/>
         </w:rPr>
-        <w:t xml:space="preserve"> }}</w:t>
+        <w:t xml:space="preserve"> }</w:t>
+      </w:r>
+      <w:proofErr w:type="gramEnd"/>
+      <w:r>
+        <w:rPr>
+          <w:rFonts w:ascii="Times New Roman" w:hAnsi="Times New Roman" w:cs="Times New Roman"/>
+          <w:sz w:val="24"/>
+          <w:szCs w:val="24"/>
+        </w:rPr>
+        <w:t>}</w:t>
       </w:r>
     </w:p>
     <w:p>
@@ -3590,6 +4182,7 @@
         </w:rPr>
         <w:t xml:space="preserve">Осуществление трансграничной передачи персональных данных: </w:t>
       </w:r>
+      <w:proofErr w:type="gramStart"/>
       <w:r>
         <w:rPr>
           <w:rStyle w:val="hinttext"/>
@@ -3607,7 +4200,17 @@
           <w:sz w:val="24"/>
           <w:szCs w:val="24"/>
         </w:rPr>
-        <w:t>cross_border_transfer</w:t>
+        <w:t>cross</w:t>
+      </w:r>
+      <w:proofErr w:type="gramEnd"/>
+      <w:r>
+        <w:rPr>
+          <w:rStyle w:val="hinttext"/>
+          <w:rFonts w:ascii="Times New Roman" w:hAnsi="Times New Roman"/>
+          <w:sz w:val="24"/>
+          <w:szCs w:val="24"/>
+        </w:rPr>
+        <w:t>_border_transfer</w:t>
       </w:r>
       <w:proofErr w:type="spellEnd"/>
       <w:r>
@@ -3619,6 +4222,7 @@
         </w:rPr>
         <w:t>_</w:t>
       </w:r>
+      <w:proofErr w:type="gramStart"/>
       <w:r>
         <w:rPr>
           <w:rStyle w:val="hinttext"/>
@@ -3636,7 +4240,17 @@
           <w:sz w:val="24"/>
           <w:szCs w:val="24"/>
         </w:rPr>
-        <w:t xml:space="preserve"> }}</w:t>
+        <w:t xml:space="preserve"> }</w:t>
+      </w:r>
+      <w:proofErr w:type="gramEnd"/>
+      <w:r>
+        <w:rPr>
+          <w:rStyle w:val="hinttext"/>
+          <w:rFonts w:ascii="Times New Roman" w:hAnsi="Times New Roman"/>
+          <w:sz w:val="24"/>
+          <w:szCs w:val="24"/>
+        </w:rPr>
+        <w:t>}</w:t>
       </w:r>
     </w:p>
     <w:p>
@@ -3742,6 +4356,7 @@
                 <w:lang w:val="en-US"/>
               </w:rPr>
             </w:pPr>
+            <w:proofErr w:type="gramStart"/>
             <w:r>
               <w:rPr>
                 <w:rFonts w:ascii="Times New Roman" w:hAnsi="Times New Roman"/>
@@ -3759,7 +4374,27 @@
                 <w:szCs w:val="24"/>
                 <w:lang w:val="en-US"/>
               </w:rPr>
-              <w:t>cod.COD_name</w:t>
+              <w:t>cod.COD</w:t>
+            </w:r>
+            <w:proofErr w:type="gramEnd"/>
+            <w:r>
+              <w:rPr>
+                <w:rFonts w:ascii="Times New Roman" w:hAnsi="Times New Roman"/>
+                <w:sz w:val="24"/>
+                <w:szCs w:val="24"/>
+                <w:lang w:val="en-US"/>
+              </w:rPr>
+              <w:t>_</w:t>
+            </w:r>
+            <w:proofErr w:type="gramStart"/>
+            <w:r>
+              <w:rPr>
+                <w:rFonts w:ascii="Times New Roman" w:hAnsi="Times New Roman"/>
+                <w:sz w:val="24"/>
+                <w:szCs w:val="24"/>
+                <w:lang w:val="en-US"/>
+              </w:rPr>
+              <w:t>name</w:t>
             </w:r>
             <w:proofErr w:type="spellEnd"/>
             <w:r>
@@ -3769,7 +4404,17 @@
                 <w:szCs w:val="24"/>
                 <w:lang w:val="en-US"/>
               </w:rPr>
-              <w:t xml:space="preserve"> }}</w:t>
+              <w:t xml:space="preserve"> }</w:t>
+            </w:r>
+            <w:proofErr w:type="gramEnd"/>
+            <w:r>
+              <w:rPr>
+                <w:rFonts w:ascii="Times New Roman" w:hAnsi="Times New Roman"/>
+                <w:sz w:val="24"/>
+                <w:szCs w:val="24"/>
+                <w:lang w:val="en-US"/>
+              </w:rPr>
+              <w:t>}</w:t>
             </w:r>
           </w:p>
           <w:p>
@@ -3801,7 +4446,17 @@
                 <w:szCs w:val="24"/>
                 <w:lang w:val="en-US"/>
               </w:rPr>
-              <w:t xml:space="preserve">: {{ </w:t>
+              <w:t xml:space="preserve">: </w:t>
+            </w:r>
+            <w:proofErr w:type="gramStart"/>
+            <w:r>
+              <w:rPr>
+                <w:rFonts w:ascii="Times New Roman" w:hAnsi="Times New Roman"/>
+                <w:sz w:val="24"/>
+                <w:szCs w:val="24"/>
+                <w:lang w:val="en-US"/>
+              </w:rPr>
+              <w:t xml:space="preserve">{{ </w:t>
             </w:r>
             <w:proofErr w:type="spellStart"/>
             <w:r>
@@ -3811,7 +4466,27 @@
                 <w:szCs w:val="24"/>
                 <w:lang w:val="en-US"/>
               </w:rPr>
-              <w:t>cod.country_of_COD</w:t>
+              <w:t>cod</w:t>
+            </w:r>
+            <w:proofErr w:type="gramEnd"/>
+            <w:r>
+              <w:rPr>
+                <w:rFonts w:ascii="Times New Roman" w:hAnsi="Times New Roman"/>
+                <w:sz w:val="24"/>
+                <w:szCs w:val="24"/>
+                <w:lang w:val="en-US"/>
+              </w:rPr>
+              <w:t>.country_of_</w:t>
+            </w:r>
+            <w:proofErr w:type="gramStart"/>
+            <w:r>
+              <w:rPr>
+                <w:rFonts w:ascii="Times New Roman" w:hAnsi="Times New Roman"/>
+                <w:sz w:val="24"/>
+                <w:szCs w:val="24"/>
+                <w:lang w:val="en-US"/>
+              </w:rPr>
+              <w:t>COD</w:t>
             </w:r>
             <w:proofErr w:type="spellEnd"/>
             <w:r>
@@ -3821,7 +4496,17 @@
                 <w:szCs w:val="24"/>
                 <w:lang w:val="en-US"/>
               </w:rPr>
-              <w:t xml:space="preserve"> }}</w:t>
+              <w:t xml:space="preserve"> }</w:t>
+            </w:r>
+            <w:proofErr w:type="gramEnd"/>
+            <w:r>
+              <w:rPr>
+                <w:rFonts w:ascii="Times New Roman" w:hAnsi="Times New Roman"/>
+                <w:sz w:val="24"/>
+                <w:szCs w:val="24"/>
+                <w:lang w:val="en-US"/>
+              </w:rPr>
+              <w:t>}</w:t>
             </w:r>
           </w:p>
           <w:p>
@@ -3873,7 +4558,17 @@
                 <w:szCs w:val="24"/>
                 <w:lang w:val="en-US"/>
               </w:rPr>
-              <w:t xml:space="preserve">: {{ </w:t>
+              <w:t xml:space="preserve">: </w:t>
+            </w:r>
+            <w:proofErr w:type="gramStart"/>
+            <w:r>
+              <w:rPr>
+                <w:rFonts w:ascii="Times New Roman" w:hAnsi="Times New Roman"/>
+                <w:sz w:val="24"/>
+                <w:szCs w:val="24"/>
+                <w:lang w:val="en-US"/>
+              </w:rPr>
+              <w:t xml:space="preserve">{{ </w:t>
             </w:r>
             <w:proofErr w:type="spellStart"/>
             <w:r>
@@ -3883,7 +4578,27 @@
                 <w:szCs w:val="24"/>
                 <w:lang w:val="en-US"/>
               </w:rPr>
-              <w:t>cod.COD_address</w:t>
+              <w:t>cod.COD</w:t>
+            </w:r>
+            <w:proofErr w:type="gramEnd"/>
+            <w:r>
+              <w:rPr>
+                <w:rFonts w:ascii="Times New Roman" w:hAnsi="Times New Roman"/>
+                <w:sz w:val="24"/>
+                <w:szCs w:val="24"/>
+                <w:lang w:val="en-US"/>
+              </w:rPr>
+              <w:t>_</w:t>
+            </w:r>
+            <w:proofErr w:type="gramStart"/>
+            <w:r>
+              <w:rPr>
+                <w:rFonts w:ascii="Times New Roman" w:hAnsi="Times New Roman"/>
+                <w:sz w:val="24"/>
+                <w:szCs w:val="24"/>
+                <w:lang w:val="en-US"/>
+              </w:rPr>
+              <w:t>address</w:t>
             </w:r>
             <w:proofErr w:type="spellEnd"/>
             <w:r>
@@ -3893,7 +4608,17 @@
                 <w:szCs w:val="24"/>
                 <w:lang w:val="en-US"/>
               </w:rPr>
-              <w:t xml:space="preserve"> }}</w:t>
+              <w:t xml:space="preserve"> }</w:t>
+            </w:r>
+            <w:proofErr w:type="gramEnd"/>
+            <w:r>
+              <w:rPr>
+                <w:rFonts w:ascii="Times New Roman" w:hAnsi="Times New Roman"/>
+                <w:sz w:val="24"/>
+                <w:szCs w:val="24"/>
+                <w:lang w:val="en-US"/>
+              </w:rPr>
+              <w:t>}</w:t>
             </w:r>
           </w:p>
           <w:p>
@@ -3925,7 +4650,17 @@
                 <w:szCs w:val="24"/>
                 <w:lang w:val="en-US"/>
               </w:rPr>
-              <w:t xml:space="preserve"> ЦОД: {{ </w:t>
+              <w:t xml:space="preserve"> ЦОД: </w:t>
+            </w:r>
+            <w:proofErr w:type="gramStart"/>
+            <w:r>
+              <w:rPr>
+                <w:rFonts w:ascii="Times New Roman" w:hAnsi="Times New Roman"/>
+                <w:sz w:val="24"/>
+                <w:szCs w:val="24"/>
+                <w:lang w:val="en-US"/>
+              </w:rPr>
+              <w:t xml:space="preserve">{{ </w:t>
             </w:r>
             <w:proofErr w:type="spellStart"/>
             <w:r>
@@ -3935,7 +4670,27 @@
                 <w:szCs w:val="24"/>
                 <w:lang w:val="en-US"/>
               </w:rPr>
-              <w:t>cod.COD_status</w:t>
+              <w:t>cod.COD</w:t>
+            </w:r>
+            <w:proofErr w:type="gramEnd"/>
+            <w:r>
+              <w:rPr>
+                <w:rFonts w:ascii="Times New Roman" w:hAnsi="Times New Roman"/>
+                <w:sz w:val="24"/>
+                <w:szCs w:val="24"/>
+                <w:lang w:val="en-US"/>
+              </w:rPr>
+              <w:t>_</w:t>
+            </w:r>
+            <w:proofErr w:type="gramStart"/>
+            <w:r>
+              <w:rPr>
+                <w:rFonts w:ascii="Times New Roman" w:hAnsi="Times New Roman"/>
+                <w:sz w:val="24"/>
+                <w:szCs w:val="24"/>
+                <w:lang w:val="en-US"/>
+              </w:rPr>
+              <w:t>status</w:t>
             </w:r>
             <w:proofErr w:type="spellEnd"/>
             <w:r>
@@ -3945,7 +4700,17 @@
                 <w:szCs w:val="24"/>
                 <w:lang w:val="en-US"/>
               </w:rPr>
-              <w:t xml:space="preserve"> }}</w:t>
+              <w:t xml:space="preserve"> }</w:t>
+            </w:r>
+            <w:proofErr w:type="gramEnd"/>
+            <w:r>
+              <w:rPr>
+                <w:rFonts w:ascii="Times New Roman" w:hAnsi="Times New Roman"/>
+                <w:sz w:val="24"/>
+                <w:szCs w:val="24"/>
+                <w:lang w:val="en-US"/>
+              </w:rPr>
+              <w:t>}</w:t>
             </w:r>
           </w:p>
           <w:p>
@@ -3958,6 +4723,7 @@
                 <w:szCs w:val="24"/>
               </w:rPr>
             </w:pPr>
+            <w:proofErr w:type="gramStart"/>
             <w:r>
               <w:rPr>
                 <w:rFonts w:ascii="Times New Roman" w:hAnsi="Times New Roman"/>
@@ -3975,7 +4741,17 @@
                 <w:szCs w:val="24"/>
                 <w:lang w:val="en-US"/>
               </w:rPr>
-              <w:t>cod.owner_info</w:t>
+              <w:t>cod</w:t>
+            </w:r>
+            <w:proofErr w:type="gramEnd"/>
+            <w:r>
+              <w:rPr>
+                <w:rFonts w:ascii="Times New Roman" w:hAnsi="Times New Roman"/>
+                <w:sz w:val="24"/>
+                <w:szCs w:val="24"/>
+                <w:lang w:val="en-US"/>
+              </w:rPr>
+              <w:t>.owner_info</w:t>
             </w:r>
             <w:proofErr w:type="spellEnd"/>
             <w:r>
@@ -4149,6 +4925,7 @@
                 <w:lang w:val="en-US"/>
               </w:rPr>
             </w:pPr>
+            <w:proofErr w:type="gramStart"/>
             <w:r>
               <w:rPr>
                 <w:rFonts w:ascii="Times New Roman" w:hAnsi="Times New Roman"/>
@@ -4166,7 +4943,27 @@
                 <w:szCs w:val="24"/>
                 <w:lang w:val="en-US"/>
               </w:rPr>
-              <w:t>person.display_name</w:t>
+              <w:t>person</w:t>
+            </w:r>
+            <w:proofErr w:type="gramEnd"/>
+            <w:r>
+              <w:rPr>
+                <w:rFonts w:ascii="Times New Roman" w:hAnsi="Times New Roman"/>
+                <w:sz w:val="24"/>
+                <w:szCs w:val="24"/>
+                <w:lang w:val="en-US"/>
+              </w:rPr>
+              <w:t>.display_</w:t>
+            </w:r>
+            <w:proofErr w:type="gramStart"/>
+            <w:r>
+              <w:rPr>
+                <w:rFonts w:ascii="Times New Roman" w:hAnsi="Times New Roman"/>
+                <w:sz w:val="24"/>
+                <w:szCs w:val="24"/>
+                <w:lang w:val="en-US"/>
+              </w:rPr>
+              <w:t>name</w:t>
             </w:r>
             <w:proofErr w:type="spellEnd"/>
             <w:r>
@@ -4176,7 +4973,17 @@
                 <w:szCs w:val="24"/>
                 <w:lang w:val="en-US"/>
               </w:rPr>
-              <w:t xml:space="preserve"> }}</w:t>
+              <w:t xml:space="preserve"> }</w:t>
+            </w:r>
+            <w:proofErr w:type="gramEnd"/>
+            <w:r>
+              <w:rPr>
+                <w:rFonts w:ascii="Times New Roman" w:hAnsi="Times New Roman"/>
+                <w:sz w:val="24"/>
+                <w:szCs w:val="24"/>
+                <w:lang w:val="en-US"/>
+              </w:rPr>
+              <w:t>}</w:t>
             </w:r>
           </w:p>
           <w:p>
@@ -4227,7 +5034,17 @@
                 <w:szCs w:val="24"/>
                 <w:lang w:val="en-US"/>
               </w:rPr>
-              <w:t xml:space="preserve">: {{ </w:t>
+              <w:t xml:space="preserve">: </w:t>
+            </w:r>
+            <w:proofErr w:type="gramStart"/>
+            <w:r>
+              <w:rPr>
+                <w:rFonts w:ascii="Times New Roman" w:hAnsi="Times New Roman"/>
+                <w:sz w:val="24"/>
+                <w:szCs w:val="24"/>
+                <w:lang w:val="en-US"/>
+              </w:rPr>
+              <w:t xml:space="preserve">{{ </w:t>
             </w:r>
             <w:proofErr w:type="spellStart"/>
             <w:r>
@@ -4237,7 +5054,27 @@
                 <w:szCs w:val="24"/>
                 <w:lang w:val="en-US"/>
               </w:rPr>
-              <w:t>person.individuals_type</w:t>
+              <w:t>person</w:t>
+            </w:r>
+            <w:proofErr w:type="gramEnd"/>
+            <w:r>
+              <w:rPr>
+                <w:rFonts w:ascii="Times New Roman" w:hAnsi="Times New Roman"/>
+                <w:sz w:val="24"/>
+                <w:szCs w:val="24"/>
+                <w:lang w:val="en-US"/>
+              </w:rPr>
+              <w:t>.individuals_</w:t>
+            </w:r>
+            <w:proofErr w:type="gramStart"/>
+            <w:r>
+              <w:rPr>
+                <w:rFonts w:ascii="Times New Roman" w:hAnsi="Times New Roman"/>
+                <w:sz w:val="24"/>
+                <w:szCs w:val="24"/>
+                <w:lang w:val="en-US"/>
+              </w:rPr>
+              <w:t>type</w:t>
             </w:r>
             <w:proofErr w:type="spellEnd"/>
             <w:r>
@@ -4247,7 +5084,17 @@
                 <w:szCs w:val="24"/>
                 <w:lang w:val="en-US"/>
               </w:rPr>
-              <w:t xml:space="preserve"> }}</w:t>
+              <w:t xml:space="preserve"> }</w:t>
+            </w:r>
+            <w:proofErr w:type="gramEnd"/>
+            <w:r>
+              <w:rPr>
+                <w:rFonts w:ascii="Times New Roman" w:hAnsi="Times New Roman"/>
+                <w:sz w:val="24"/>
+                <w:szCs w:val="24"/>
+                <w:lang w:val="en-US"/>
+              </w:rPr>
+              <w:t>}</w:t>
             </w:r>
           </w:p>
           <w:p>
@@ -4260,6 +5107,7 @@
                 <w:lang w:val="en-US"/>
               </w:rPr>
             </w:pPr>
+            <w:proofErr w:type="gramStart"/>
             <w:r>
               <w:rPr>
                 <w:rFonts w:ascii="Times New Roman" w:hAnsi="Times New Roman"/>
@@ -4277,7 +5125,27 @@
                 <w:szCs w:val="24"/>
                 <w:lang w:val="en-US"/>
               </w:rPr>
-              <w:t>person.name_label</w:t>
+              <w:t>person.name</w:t>
+            </w:r>
+            <w:proofErr w:type="gramEnd"/>
+            <w:r>
+              <w:rPr>
+                <w:rFonts w:ascii="Times New Roman" w:hAnsi="Times New Roman"/>
+                <w:sz w:val="24"/>
+                <w:szCs w:val="24"/>
+                <w:lang w:val="en-US"/>
+              </w:rPr>
+              <w:t>_</w:t>
+            </w:r>
+            <w:proofErr w:type="gramStart"/>
+            <w:r>
+              <w:rPr>
+                <w:rFonts w:ascii="Times New Roman" w:hAnsi="Times New Roman"/>
+                <w:sz w:val="24"/>
+                <w:szCs w:val="24"/>
+                <w:lang w:val="en-US"/>
+              </w:rPr>
+              <w:t>label</w:t>
             </w:r>
             <w:proofErr w:type="spellEnd"/>
             <w:r>
@@ -4287,7 +5155,27 @@
                 <w:szCs w:val="24"/>
                 <w:lang w:val="en-US"/>
               </w:rPr>
-              <w:t xml:space="preserve"> }}: {{ </w:t>
+              <w:t xml:space="preserve"> }</w:t>
+            </w:r>
+            <w:proofErr w:type="gramEnd"/>
+            <w:r>
+              <w:rPr>
+                <w:rFonts w:ascii="Times New Roman" w:hAnsi="Times New Roman"/>
+                <w:sz w:val="24"/>
+                <w:szCs w:val="24"/>
+                <w:lang w:val="en-US"/>
+              </w:rPr>
+              <w:t xml:space="preserve">}: </w:t>
+            </w:r>
+            <w:proofErr w:type="gramStart"/>
+            <w:r>
+              <w:rPr>
+                <w:rFonts w:ascii="Times New Roman" w:hAnsi="Times New Roman"/>
+                <w:sz w:val="24"/>
+                <w:szCs w:val="24"/>
+                <w:lang w:val="en-US"/>
+              </w:rPr>
+              <w:t xml:space="preserve">{{ </w:t>
             </w:r>
             <w:proofErr w:type="spellStart"/>
             <w:r>
@@ -4297,7 +5185,27 @@
                 <w:szCs w:val="24"/>
                 <w:lang w:val="en-US"/>
               </w:rPr>
-              <w:t>person.individuals_name</w:t>
+              <w:t>person</w:t>
+            </w:r>
+            <w:proofErr w:type="gramEnd"/>
+            <w:r>
+              <w:rPr>
+                <w:rFonts w:ascii="Times New Roman" w:hAnsi="Times New Roman"/>
+                <w:sz w:val="24"/>
+                <w:szCs w:val="24"/>
+                <w:lang w:val="en-US"/>
+              </w:rPr>
+              <w:t>.individuals_</w:t>
+            </w:r>
+            <w:proofErr w:type="gramStart"/>
+            <w:r>
+              <w:rPr>
+                <w:rFonts w:ascii="Times New Roman" w:hAnsi="Times New Roman"/>
+                <w:sz w:val="24"/>
+                <w:szCs w:val="24"/>
+                <w:lang w:val="en-US"/>
+              </w:rPr>
+              <w:t>name</w:t>
             </w:r>
             <w:proofErr w:type="spellEnd"/>
             <w:r>
@@ -4307,7 +5215,17 @@
                 <w:szCs w:val="24"/>
                 <w:lang w:val="en-US"/>
               </w:rPr>
-              <w:t xml:space="preserve"> }}</w:t>
+              <w:t xml:space="preserve"> }</w:t>
+            </w:r>
+            <w:proofErr w:type="gramEnd"/>
+            <w:r>
+              <w:rPr>
+                <w:rFonts w:ascii="Times New Roman" w:hAnsi="Times New Roman"/>
+                <w:sz w:val="24"/>
+                <w:szCs w:val="24"/>
+                <w:lang w:val="en-US"/>
+              </w:rPr>
+              <w:t>}</w:t>
             </w:r>
           </w:p>
           <w:p>
@@ -4338,7 +5256,17 @@
                 <w:szCs w:val="24"/>
                 <w:lang w:val="en-US"/>
               </w:rPr>
-              <w:t xml:space="preserve">: {{ </w:t>
+              <w:t xml:space="preserve">: </w:t>
+            </w:r>
+            <w:proofErr w:type="gramStart"/>
+            <w:r>
+              <w:rPr>
+                <w:rFonts w:ascii="Times New Roman" w:hAnsi="Times New Roman"/>
+                <w:sz w:val="24"/>
+                <w:szCs w:val="24"/>
+                <w:lang w:val="en-US"/>
+              </w:rPr>
+              <w:t xml:space="preserve">{{ </w:t>
             </w:r>
             <w:proofErr w:type="spellStart"/>
             <w:r>
@@ -4348,7 +5276,27 @@
                 <w:szCs w:val="24"/>
                 <w:lang w:val="en-US"/>
               </w:rPr>
-              <w:t>person.individuals_address</w:t>
+              <w:t>person</w:t>
+            </w:r>
+            <w:proofErr w:type="gramEnd"/>
+            <w:r>
+              <w:rPr>
+                <w:rFonts w:ascii="Times New Roman" w:hAnsi="Times New Roman"/>
+                <w:sz w:val="24"/>
+                <w:szCs w:val="24"/>
+                <w:lang w:val="en-US"/>
+              </w:rPr>
+              <w:t>.individuals_</w:t>
+            </w:r>
+            <w:proofErr w:type="gramStart"/>
+            <w:r>
+              <w:rPr>
+                <w:rFonts w:ascii="Times New Roman" w:hAnsi="Times New Roman"/>
+                <w:sz w:val="24"/>
+                <w:szCs w:val="24"/>
+                <w:lang w:val="en-US"/>
+              </w:rPr>
+              <w:t>address</w:t>
             </w:r>
             <w:proofErr w:type="spellEnd"/>
             <w:r>
@@ -4358,7 +5306,17 @@
                 <w:szCs w:val="24"/>
                 <w:lang w:val="en-US"/>
               </w:rPr>
-              <w:t xml:space="preserve"> }}</w:t>
+              <w:t xml:space="preserve"> }</w:t>
+            </w:r>
+            <w:proofErr w:type="gramEnd"/>
+            <w:r>
+              <w:rPr>
+                <w:rFonts w:ascii="Times New Roman" w:hAnsi="Times New Roman"/>
+                <w:sz w:val="24"/>
+                <w:szCs w:val="24"/>
+                <w:lang w:val="en-US"/>
+              </w:rPr>
+              <w:t>}</w:t>
             </w:r>
           </w:p>
           <w:p>
@@ -4409,7 +5367,17 @@
                 <w:szCs w:val="24"/>
                 <w:lang w:val="en-US"/>
               </w:rPr>
-              <w:t xml:space="preserve">: {{ </w:t>
+              <w:t xml:space="preserve">: </w:t>
+            </w:r>
+            <w:proofErr w:type="gramStart"/>
+            <w:r>
+              <w:rPr>
+                <w:rFonts w:ascii="Times New Roman" w:hAnsi="Times New Roman"/>
+                <w:sz w:val="24"/>
+                <w:szCs w:val="24"/>
+                <w:lang w:val="en-US"/>
+              </w:rPr>
+              <w:t xml:space="preserve">{{ </w:t>
             </w:r>
             <w:proofErr w:type="spellStart"/>
             <w:r>
@@ -4419,7 +5387,27 @@
                 <w:szCs w:val="24"/>
                 <w:lang w:val="en-US"/>
               </w:rPr>
-              <w:t>person.individuals_email</w:t>
+              <w:t>person</w:t>
+            </w:r>
+            <w:proofErr w:type="gramEnd"/>
+            <w:r>
+              <w:rPr>
+                <w:rFonts w:ascii="Times New Roman" w:hAnsi="Times New Roman"/>
+                <w:sz w:val="24"/>
+                <w:szCs w:val="24"/>
+                <w:lang w:val="en-US"/>
+              </w:rPr>
+              <w:t>.individuals_</w:t>
+            </w:r>
+            <w:proofErr w:type="gramStart"/>
+            <w:r>
+              <w:rPr>
+                <w:rFonts w:ascii="Times New Roman" w:hAnsi="Times New Roman"/>
+                <w:sz w:val="24"/>
+                <w:szCs w:val="24"/>
+                <w:lang w:val="en-US"/>
+              </w:rPr>
+              <w:t>email</w:t>
             </w:r>
             <w:proofErr w:type="spellEnd"/>
             <w:r>
@@ -4429,7 +5417,17 @@
                 <w:szCs w:val="24"/>
                 <w:lang w:val="en-US"/>
               </w:rPr>
-              <w:t xml:space="preserve"> }}</w:t>
+              <w:t xml:space="preserve"> }</w:t>
+            </w:r>
+            <w:proofErr w:type="gramEnd"/>
+            <w:r>
+              <w:rPr>
+                <w:rFonts w:ascii="Times New Roman" w:hAnsi="Times New Roman"/>
+                <w:sz w:val="24"/>
+                <w:szCs w:val="24"/>
+                <w:lang w:val="en-US"/>
+              </w:rPr>
+              <w:t>}</w:t>
             </w:r>
           </w:p>
           <w:p>
@@ -4481,7 +5479,17 @@
                 <w:szCs w:val="24"/>
                 <w:lang w:val="en-US"/>
               </w:rPr>
-              <w:t xml:space="preserve">: {{ </w:t>
+              <w:t xml:space="preserve">: </w:t>
+            </w:r>
+            <w:proofErr w:type="gramStart"/>
+            <w:r>
+              <w:rPr>
+                <w:rFonts w:ascii="Times New Roman" w:hAnsi="Times New Roman"/>
+                <w:sz w:val="24"/>
+                <w:szCs w:val="24"/>
+                <w:lang w:val="en-US"/>
+              </w:rPr>
+              <w:t xml:space="preserve">{{ </w:t>
             </w:r>
             <w:proofErr w:type="spellStart"/>
             <w:r>
@@ -4491,7 +5499,17 @@
                 <w:szCs w:val="24"/>
                 <w:lang w:val="en-US"/>
               </w:rPr>
-              <w:t>person.individuals_phone</w:t>
+              <w:t>person</w:t>
+            </w:r>
+            <w:proofErr w:type="gramEnd"/>
+            <w:r>
+              <w:rPr>
+                <w:rFonts w:ascii="Times New Roman" w:hAnsi="Times New Roman"/>
+                <w:sz w:val="24"/>
+                <w:szCs w:val="24"/>
+                <w:lang w:val="en-US"/>
+              </w:rPr>
+              <w:t>.individuals_phone</w:t>
             </w:r>
             <w:proofErr w:type="spellEnd"/>
             <w:r>
@@ -4622,6 +5640,7 @@
         </w:rPr>
         <w:t xml:space="preserve">ФИО исполнителя: </w:t>
       </w:r>
+      <w:proofErr w:type="gramStart"/>
       <w:r>
         <w:rPr>
           <w:rStyle w:val="hinttext"/>
@@ -4641,6 +5660,7 @@
         </w:rPr>
         <w:t>main</w:t>
       </w:r>
+      <w:proofErr w:type="gramEnd"/>
       <w:r>
         <w:rPr>
           <w:rStyle w:val="hinttext"/>
@@ -4650,6 +5670,7 @@
         </w:rPr>
         <w:t>_</w:t>
       </w:r>
+      <w:proofErr w:type="gramStart"/>
       <w:r>
         <w:rPr>
           <w:rStyle w:val="hinttext"/>
@@ -4667,7 +5688,17 @@
           <w:sz w:val="24"/>
           <w:szCs w:val="24"/>
         </w:rPr>
-        <w:t xml:space="preserve"> }}</w:t>
+        <w:t xml:space="preserve"> }</w:t>
+      </w:r>
+      <w:proofErr w:type="gramEnd"/>
+      <w:r>
+        <w:rPr>
+          <w:rStyle w:val="hinttext"/>
+          <w:rFonts w:ascii="Times New Roman" w:hAnsi="Times New Roman" w:cs="Times New Roman"/>
+          <w:sz w:val="24"/>
+          <w:szCs w:val="24"/>
+        </w:rPr>
+        <w:t>}</w:t>
       </w:r>
     </w:p>
     <w:p>
@@ -4693,6 +5724,7 @@
         </w:rPr>
         <w:t xml:space="preserve"> </w:t>
       </w:r>
+      <w:proofErr w:type="gramStart"/>
       <w:r>
         <w:rPr>
           <w:rFonts w:ascii="Times New Roman" w:hAnsi="Times New Roman" w:cs="Times New Roman"/>
@@ -4710,6 +5742,7 @@
         </w:rPr>
         <w:t>main</w:t>
       </w:r>
+      <w:proofErr w:type="gramEnd"/>
       <w:r>
         <w:rPr>
           <w:rFonts w:ascii="Times New Roman" w:hAnsi="Times New Roman" w:cs="Times New Roman"/>
@@ -4718,6 +5751,7 @@
         </w:rPr>
         <w:t>_</w:t>
       </w:r>
+      <w:proofErr w:type="gramStart"/>
       <w:r>
         <w:rPr>
           <w:rFonts w:ascii="Times New Roman" w:hAnsi="Times New Roman" w:cs="Times New Roman"/>
@@ -4733,7 +5767,16 @@
           <w:sz w:val="24"/>
           <w:szCs w:val="24"/>
         </w:rPr>
-        <w:t xml:space="preserve"> }}</w:t>
+        <w:t xml:space="preserve"> }</w:t>
+      </w:r>
+      <w:proofErr w:type="gramEnd"/>
+      <w:r>
+        <w:rPr>
+          <w:rFonts w:ascii="Times New Roman" w:hAnsi="Times New Roman" w:cs="Times New Roman"/>
+          <w:sz w:val="24"/>
+          <w:szCs w:val="24"/>
+        </w:rPr>
+        <w:t>}</w:t>
       </w:r>
     </w:p>
     <w:p>
@@ -4762,6 +5805,7 @@
         </w:rPr>
         <w:t xml:space="preserve"> </w:t>
       </w:r>
+      <w:proofErr w:type="gramStart"/>
       <w:r>
         <w:rPr>
           <w:rStyle w:val="hinttext"/>
@@ -4781,6 +5825,7 @@
         </w:rPr>
         <w:t>main</w:t>
       </w:r>
+      <w:proofErr w:type="gramEnd"/>
       <w:r>
         <w:rPr>
           <w:rStyle w:val="hinttext"/>
@@ -4790,6 +5835,7 @@
         </w:rPr>
         <w:t>_</w:t>
       </w:r>
+      <w:proofErr w:type="gramStart"/>
       <w:r>
         <w:rPr>
           <w:rStyle w:val="hinttext"/>
@@ -4807,7 +5853,17 @@
           <w:sz w:val="24"/>
           <w:szCs w:val="24"/>
         </w:rPr>
-        <w:t xml:space="preserve"> }}</w:t>
+        <w:t xml:space="preserve"> }</w:t>
+      </w:r>
+      <w:proofErr w:type="gramEnd"/>
+      <w:r>
+        <w:rPr>
+          <w:rStyle w:val="hinttext"/>
+          <w:rFonts w:ascii="Times New Roman" w:hAnsi="Times New Roman" w:cs="Times New Roman"/>
+          <w:sz w:val="24"/>
+          <w:szCs w:val="24"/>
+        </w:rPr>
+        <w:t>}</w:t>
       </w:r>
     </w:p>
     <w:p>
@@ -4956,6 +6012,7 @@
         <w:spacing w:after="0" w:line="240" w:lineRule="auto"/>
         <w:ind w:left="-567" w:firstLine="567"/>
       </w:pPr>
+      <w:proofErr w:type="gramStart"/>
       <w:r>
         <w:rPr>
           <w:rFonts w:ascii="Times New Roman" w:eastAsia="Times New Roman" w:hAnsi="Times New Roman" w:cs="Times New Roman"/>
@@ -4964,7 +6021,18 @@
           <w:szCs w:val="27"/>
           <w:lang w:val="en-US" w:eastAsia="ru-RU"/>
         </w:rPr>
-        <w:t>{{ date }}</w:t>
+        <w:t>{{ date</w:t>
+      </w:r>
+      <w:proofErr w:type="gramEnd"/>
+      <w:r>
+        <w:rPr>
+          <w:rFonts w:ascii="Times New Roman" w:eastAsia="Times New Roman" w:hAnsi="Times New Roman" w:cs="Times New Roman"/>
+          <w:color w:val="000000"/>
+          <w:sz w:val="27"/>
+          <w:szCs w:val="27"/>
+          <w:lang w:val="en-US" w:eastAsia="ru-RU"/>
+        </w:rPr>
+        <w:t xml:space="preserve"> }}</w:t>
       </w:r>
       <w:r>
         <w:rPr>

</xml_diff>